<commit_message>
Insert killer figure + sensitivity figure into paper, fix Gemma-3 limitation
- Added Figure 1 (killer figure): GQA ratio vs PPL degradation plot at the
  end of the Introduction, showing the monotonic decrease in TQ advantage
  with increasing GQA ratio across 5 models.
- Sensitivity figure (Figure 2) was already properly placed in Section 6.
- Updated Gemma-3 limitation paragraph: NaN is now fixed (hook-based
  calibration), so we report the fix rather than the workaround.
- Rebuilt PDF (14 pages) and DOCX with both figures embedded.

Co-Authored-By: Claude Opus 4.6 (1M context) <noreply@anthropic.com>
</commit_message>
<xml_diff>
--- a/paper/main.docx
+++ b/paper/main.docx
@@ -2557,129 +2557,141 @@
     </w:p>
     <w:p>
       <w:pPr>
-        <w:pStyle w:val="Heading1"/>
-      </w:pPr>
-      <w:bookmarkStart w:id="23" w:name="sec:related"/>
-      <w:r>
-        <w:t xml:space="preserve">Background and Related Work</w:t>
-      </w:r>
-      <w:bookmarkEnd w:id="23"/>
-    </w:p>
-    <w:p>
-      <w:pPr>
-        <w:pStyle w:val="Heading4"/>
-      </w:pPr>
-      <w:bookmarkStart w:id="24" w:name="kv-cache-quantization."/>
-      <w:r>
-        <w:t xml:space="preserve">KV cache quantization.</w:t>
+        <w:pStyle w:val="CaptionedFigure"/>
+      </w:pPr>
+      <w:bookmarkStart w:id="24" w:name="fig:killer"/>
+      <w:r>
+        <w:drawing>
+          <wp:inline>
+            <wp:extent cx="5334000" cy="3517556"/>
+            <wp:effectExtent b="0" l="0" r="0" t="0"/>
+            <wp:docPr descr="GQA amplification in action. Relative WikiText-2 perplexity degradation (log scale) for TurboQuant K4V4, KIVI-4, TurboQuant-Adaptive, and TurboQuant-Outlier across five models at four GQA ratios. TurboQuant’s advantage over KIVI decreases monotonically with GQA ratio, crossing over between 5{:}1 and 8{:}1. On Qwen2.5-3B (GQA 8{:}1), uniform TurboQuant collapses while our outlier-aware variant recovers near-FP16 quality." title="" id="1" name="Picture"/>
+            <a:graphic>
+              <a:graphicData uri="http://schemas.openxmlformats.org/drawingml/2006/picture">
+                <pic:pic>
+                  <pic:nvPicPr>
+                    <pic:cNvPr descr="figures/killer.png" id="0" name="Picture"/>
+                    <pic:cNvPicPr>
+                      <a:picLocks noChangeArrowheads="1" noChangeAspect="1"/>
+                    </pic:cNvPicPr>
+                  </pic:nvPicPr>
+                  <pic:blipFill>
+                    <a:blip r:embed="rId23"/>
+                    <a:stretch>
+                      <a:fillRect/>
+                    </a:stretch>
+                  </pic:blipFill>
+                  <pic:spPr bwMode="auto">
+                    <a:xfrm>
+                      <a:off x="0" y="0"/>
+                      <a:ext cx="5334000" cy="3517556"/>
+                    </a:xfrm>
+                    <a:prstGeom prst="rect">
+                      <a:avLst/>
+                    </a:prstGeom>
+                    <a:noFill/>
+                    <a:ln w="9525">
+                      <a:noFill/>
+                      <a:headEnd/>
+                      <a:tailEnd/>
+                    </a:ln>
+                  </pic:spPr>
+                </pic:pic>
+              </a:graphicData>
+            </a:graphic>
+          </wp:inline>
+        </w:drawing>
       </w:r>
       <w:bookmarkEnd w:id="24"/>
     </w:p>
     <w:p>
       <w:pPr>
-        <w:pStyle w:val="FirstParagraph"/>
-      </w:pPr>
-      <w:r>
-        <w:t xml:space="preserve">Work on KV cache compression targets inference-time memory pressure without retraining. Early methods</w:t>
-      </w:r>
-      <w:r>
-        <w:t xml:space="preserve"> </w:t>
-      </w:r>
-      <w:r>
-        <w:t xml:space="preserve"> </w:t>
-      </w:r>
-      <w:r>
-        <w:t xml:space="preserve">combined weight and KV quantization with CPU/GPU offload. KIVI</w:t>
-      </w:r>
-      <w:r>
-        <w:t xml:space="preserve"> </w:t>
-      </w:r>
-      <w:r>
-        <w:t xml:space="preserve"> </w:t>
-      </w:r>
-      <w:r>
-        <w:t xml:space="preserve">introduced mixed per-channel (key) and per-token (value) asymmetric quantization, observing that keys have more stable per-channel structure while values are more token-local. KVQuant</w:t>
-      </w:r>
-      <w:r>
-        <w:t xml:space="preserve"> </w:t>
-      </w:r>
-      <w:r>
-        <w:t xml:space="preserve"> </w:t>
-      </w:r>
-      <w:r>
-        <w:t xml:space="preserve">added outlier isolation and non-uniform quantization grids. PolarQuant</w:t>
-      </w:r>
-      <w:r>
-        <w:t xml:space="preserve"> </w:t>
-      </w:r>
-      <w:r>
-        <w:t xml:space="preserve"> </w:t>
-      </w:r>
-      <w:r>
-        <w:t xml:space="preserve">applied a polar decomposition of the projection matrices instead of random rotation. TurboQuant</w:t>
-      </w:r>
-      <w:r>
-        <w:t xml:space="preserve"> </w:t>
-      </w:r>
-      <w:r>
-        <w:t xml:space="preserve"> </w:t>
-      </w:r>
-      <w:r>
-        <w:t xml:space="preserve">returned to random rotation but coupled it with an optimal Lloyd-Max codebook for the induced Beta distribution and proposed a two-stage pipeline with an additional QJL sketch. Our starting point is the MSE-only variant of TurboQuant (TurboQuant-V3), which discards the QJL stage that subsequent community analyses found to hurt downstream quality.</w:t>
+        <w:pStyle w:val="ImageCaption"/>
+      </w:pPr>
+      <w:r>
+        <w:rPr>
+          <w:b/>
+        </w:rPr>
+        <w:t xml:space="preserve">GQA amplification in action.</w:t>
+      </w:r>
+      <w:r>
+        <w:t xml:space="preserve"> </w:t>
+      </w:r>
+      <w:r>
+        <w:t xml:space="preserve">Relative WikiText-2 perplexity degradation (log scale) for TurboQuant K4V4, KIVI-4, TurboQuant-Adaptive, and TurboQuant-Outlier across five models at four GQA ratios. TurboQuant’s advantage over KIVI decreases monotonically with GQA ratio, crossing over between</w:t>
+      </w:r>
+      <w:r>
+        <w:t xml:space="preserve"> </w:t>
+      </w:r>
+      <m:oMath>
+        <m:r>
+          <m:t>5</m:t>
+        </m:r>
+        <m:r>
+          <m:t>:</m:t>
+        </m:r>
+        <m:r>
+          <m:t>1</m:t>
+        </m:r>
+      </m:oMath>
+      <w:r>
+        <w:t xml:space="preserve"> </w:t>
+      </w:r>
+      <w:r>
+        <w:t xml:space="preserve">and</w:t>
+      </w:r>
+      <w:r>
+        <w:t xml:space="preserve"> </w:t>
+      </w:r>
+      <m:oMath>
+        <m:r>
+          <m:t>8</m:t>
+        </m:r>
+        <m:r>
+          <m:t>:</m:t>
+        </m:r>
+        <m:r>
+          <m:t>1</m:t>
+        </m:r>
+      </m:oMath>
+      <w:r>
+        <w:t xml:space="preserve">. On Qwen2.5-3B (GQA</w:t>
+      </w:r>
+      <w:r>
+        <w:t xml:space="preserve"> </w:t>
+      </w:r>
+      <m:oMath>
+        <m:r>
+          <m:t>8</m:t>
+        </m:r>
+        <m:r>
+          <m:t>:</m:t>
+        </m:r>
+        <m:r>
+          <m:t>1</m:t>
+        </m:r>
+      </m:oMath>
+      <w:r>
+        <w:t xml:space="preserve">), uniform TurboQuant collapses while our outlier-aware variant recovers near-FP16 quality.</w:t>
       </w:r>
     </w:p>
     <w:p>
       <w:pPr>
-        <w:pStyle w:val="Heading4"/>
-      </w:pPr>
-      <w:bookmarkStart w:id="25" w:name="sensitivity-aware-quantization."/>
-      <w:r>
-        <w:t xml:space="preserve">Sensitivity-aware quantization.</w:t>
+        <w:pStyle w:val="Heading1"/>
+      </w:pPr>
+      <w:bookmarkStart w:id="25" w:name="sec:related"/>
+      <w:r>
+        <w:t xml:space="preserve">Background and Related Work</w:t>
       </w:r>
       <w:bookmarkEnd w:id="25"/>
     </w:p>
     <w:p>
       <w:pPr>
-        <w:pStyle w:val="FirstParagraph"/>
-      </w:pPr>
-      <w:r>
-        <w:t xml:space="preserve">Per-layer sensitivity has been studied extensively for weight quantization. GPTQ</w:t>
-      </w:r>
-      <w:r>
-        <w:t xml:space="preserve"> </w:t>
-      </w:r>
-      <w:r>
-        <w:t xml:space="preserve"> </w:t>
-      </w:r>
-      <w:r>
-        <w:t xml:space="preserve">and AWQ</w:t>
-      </w:r>
-      <w:r>
-        <w:t xml:space="preserve"> </w:t>
-      </w:r>
-      <w:r>
-        <w:t xml:space="preserve"> </w:t>
-      </w:r>
-      <w:r>
-        <w:t xml:space="preserve">use Hessian- or activation-based importance scores to prioritize bit allocation, and OWQ</w:t>
-      </w:r>
-      <w:r>
-        <w:t xml:space="preserve"> </w:t>
-      </w:r>
-      <w:r>
-        <w:t xml:space="preserve"> </w:t>
-      </w:r>
-      <w:r>
-        <w:t xml:space="preserve">introduces explicit per-layer bit budgets. For the KV cache, sensitivity analysis is under-explored; our adaptive allocator adapts the spirit of these methods to the streaming cache setting, where the quantity of interest is not Hessian diagonal but MSE distortion on captured calibration activations.</w:t>
-      </w:r>
-    </w:p>
-    <w:p>
-      <w:pPr>
         <w:pStyle w:val="Heading4"/>
       </w:pPr>
-      <w:bookmarkStart w:id="26" w:name="outlier-handling."/>
-      <w:r>
-        <w:t xml:space="preserve">Outlier handling.</w:t>
+      <w:bookmarkStart w:id="26" w:name="kv-cache-quantization."/>
+      <w:r>
+        <w:t xml:space="preserve">KV cache quantization.</w:t>
       </w:r>
       <w:bookmarkEnd w:id="26"/>
     </w:p>
@@ -2688,22 +2700,61 @@
         <w:pStyle w:val="FirstParagraph"/>
       </w:pPr>
       <w:r>
-        <w:t xml:space="preserve">Activation outliers are well documented in LLM inference</w:t>
-      </w:r>
-      <w:r>
-        <w:t xml:space="preserve"> </w:t>
-      </w:r>
-      <w:r>
-        <w:t xml:space="preserve">. In the weight-quantization literature, outlier channels are typically handled by migrating magnitude from activations to weights (SmoothQuant) or by storing a small FP16 residual (AWQ). KIVI handles outliers implicitly via per-channel scales. In the VQ regime, outliers are particularly damaging because a single high-magnitude channel inflates the norm and distorts the unit-sphere distribution that Lloyd-Max assumes. Our outlier-aware channel grouping is the first explicit treatment of outliers inside a VQ-based KV compressor.</w:t>
+        <w:t xml:space="preserve">Work on KV cache compression targets inference-time memory pressure without retraining. Early methods</w:t>
+      </w:r>
+      <w:r>
+        <w:t xml:space="preserve"> </w:t>
+      </w:r>
+      <w:r>
+        <w:t xml:space="preserve"> </w:t>
+      </w:r>
+      <w:r>
+        <w:t xml:space="preserve">combined weight and KV quantization with CPU/GPU offload. KIVI</w:t>
+      </w:r>
+      <w:r>
+        <w:t xml:space="preserve"> </w:t>
+      </w:r>
+      <w:r>
+        <w:t xml:space="preserve"> </w:t>
+      </w:r>
+      <w:r>
+        <w:t xml:space="preserve">introduced mixed per-channel (key) and per-token (value) asymmetric quantization, observing that keys have more stable per-channel structure while values are more token-local. KVQuant</w:t>
+      </w:r>
+      <w:r>
+        <w:t xml:space="preserve"> </w:t>
+      </w:r>
+      <w:r>
+        <w:t xml:space="preserve"> </w:t>
+      </w:r>
+      <w:r>
+        <w:t xml:space="preserve">added outlier isolation and non-uniform quantization grids. PolarQuant</w:t>
+      </w:r>
+      <w:r>
+        <w:t xml:space="preserve"> </w:t>
+      </w:r>
+      <w:r>
+        <w:t xml:space="preserve"> </w:t>
+      </w:r>
+      <w:r>
+        <w:t xml:space="preserve">applied a polar decomposition of the projection matrices instead of random rotation. TurboQuant</w:t>
+      </w:r>
+      <w:r>
+        <w:t xml:space="preserve"> </w:t>
+      </w:r>
+      <w:r>
+        <w:t xml:space="preserve"> </w:t>
+      </w:r>
+      <w:r>
+        <w:t xml:space="preserve">returned to random rotation but coupled it with an optimal Lloyd-Max codebook for the induced Beta distribution and proposed a two-stage pipeline with an additional QJL sketch. Our starting point is the MSE-only variant of TurboQuant (TurboQuant-V3), which discards the QJL stage that subsequent community analyses found to hurt downstream quality.</w:t>
       </w:r>
     </w:p>
     <w:p>
       <w:pPr>
         <w:pStyle w:val="Heading4"/>
       </w:pPr>
-      <w:bookmarkStart w:id="27" w:name="grouped-query-attention."/>
-      <w:r>
-        <w:t xml:space="preserve">Grouped Query Attention.</w:t>
+      <w:bookmarkStart w:id="27" w:name="sensitivity-aware-quantization."/>
+      <w:r>
+        <w:t xml:space="preserve">Sensitivity-aware quantization.</w:t>
       </w:r>
       <w:bookmarkEnd w:id="27"/>
     </w:p>
@@ -2712,27 +2763,96 @@
         <w:pStyle w:val="FirstParagraph"/>
       </w:pPr>
       <w:r>
-        <w:t xml:space="preserve">GQA</w:t>
-      </w:r>
-      <w:r>
-        <w:t xml:space="preserve"> </w:t>
-      </w:r>
-      <w:r>
-        <w:t xml:space="preserve"> </w:t>
-      </w:r>
-      <w:r>
-        <w:t xml:space="preserve">reduces KV cache size by sharing each KV head among several query heads. Modern models adopt aggressive ratios: Llama-3.1-70B uses GQA 8:1, Qwen2.5-3B uses GQA 8:1, and Llama-3.1-8B and Mistral-7B use GQA 4:1. The recent Gemma-3-27B uses a mild GQA 2:1. To our knowledge, no prior work has analyzed the interaction between GQA ratio and KV cache quantization error, despite the clear theoretical motivation: reducing the number of independent KV heads increases the per-head importance and thus the per-head tolerable error.</w:t>
+        <w:t xml:space="preserve">Per-layer sensitivity has been studied extensively for weight quantization. GPTQ</w:t>
+      </w:r>
+      <w:r>
+        <w:t xml:space="preserve"> </w:t>
+      </w:r>
+      <w:r>
+        <w:t xml:space="preserve"> </w:t>
+      </w:r>
+      <w:r>
+        <w:t xml:space="preserve">and AWQ</w:t>
+      </w:r>
+      <w:r>
+        <w:t xml:space="preserve"> </w:t>
+      </w:r>
+      <w:r>
+        <w:t xml:space="preserve"> </w:t>
+      </w:r>
+      <w:r>
+        <w:t xml:space="preserve">use Hessian- or activation-based importance scores to prioritize bit allocation, and OWQ</w:t>
+      </w:r>
+      <w:r>
+        <w:t xml:space="preserve"> </w:t>
+      </w:r>
+      <w:r>
+        <w:t xml:space="preserve"> </w:t>
+      </w:r>
+      <w:r>
+        <w:t xml:space="preserve">introduces explicit per-layer bit budgets. For the KV cache, sensitivity analysis is under-explored; our adaptive allocator adapts the spirit of these methods to the streaming cache setting, where the quantity of interest is not Hessian diagonal but MSE distortion on captured calibration activations.</w:t>
       </w:r>
     </w:p>
     <w:p>
       <w:pPr>
+        <w:pStyle w:val="Heading4"/>
+      </w:pPr>
+      <w:bookmarkStart w:id="28" w:name="outlier-handling."/>
+      <w:r>
+        <w:t xml:space="preserve">Outlier handling.</w:t>
+      </w:r>
+      <w:bookmarkEnd w:id="28"/>
+    </w:p>
+    <w:p>
+      <w:pPr>
+        <w:pStyle w:val="FirstParagraph"/>
+      </w:pPr>
+      <w:r>
+        <w:t xml:space="preserve">Activation outliers are well documented in LLM inference</w:t>
+      </w:r>
+      <w:r>
+        <w:t xml:space="preserve"> </w:t>
+      </w:r>
+      <w:r>
+        <w:t xml:space="preserve">. In the weight-quantization literature, outlier channels are typically handled by migrating magnitude from activations to weights (SmoothQuant) or by storing a small FP16 residual (AWQ). KIVI handles outliers implicitly via per-channel scales. In the VQ regime, outliers are particularly damaging because a single high-magnitude channel inflates the norm and distorts the unit-sphere distribution that Lloyd-Max assumes. Our outlier-aware channel grouping is the first explicit treatment of outliers inside a VQ-based KV compressor.</w:t>
+      </w:r>
+    </w:p>
+    <w:p>
+      <w:pPr>
+        <w:pStyle w:val="Heading4"/>
+      </w:pPr>
+      <w:bookmarkStart w:id="29" w:name="grouped-query-attention."/>
+      <w:r>
+        <w:t xml:space="preserve">Grouped Query Attention.</w:t>
+      </w:r>
+      <w:bookmarkEnd w:id="29"/>
+    </w:p>
+    <w:p>
+      <w:pPr>
+        <w:pStyle w:val="FirstParagraph"/>
+      </w:pPr>
+      <w:r>
+        <w:t xml:space="preserve">GQA</w:t>
+      </w:r>
+      <w:r>
+        <w:t xml:space="preserve"> </w:t>
+      </w:r>
+      <w:r>
+        <w:t xml:space="preserve"> </w:t>
+      </w:r>
+      <w:r>
+        <w:t xml:space="preserve">reduces KV cache size by sharing each KV head among several query heads. Modern models adopt aggressive ratios: Llama-3.1-70B uses GQA 8:1, Qwen2.5-3B uses GQA 8:1, and Llama-3.1-8B and Mistral-7B use GQA 4:1. The recent Gemma-3-27B uses a mild GQA 2:1. To our knowledge, no prior work has analyzed the interaction between GQA ratio and KV cache quantization error, despite the clear theoretical motivation: reducing the number of independent KV heads increases the per-head importance and thus the per-head tolerable error.</w:t>
+      </w:r>
+    </w:p>
+    <w:p>
+      <w:pPr>
         <w:pStyle w:val="Heading1"/>
       </w:pPr>
-      <w:bookmarkStart w:id="28" w:name="sec:background"/>
+      <w:bookmarkStart w:id="30" w:name="sec:background"/>
       <w:r>
         <w:t xml:space="preserve">TurboQuant Background</w:t>
       </w:r>
-      <w:bookmarkEnd w:id="28"/>
+      <w:bookmarkEnd w:id="30"/>
     </w:p>
     <w:p>
       <w:pPr>
@@ -3317,45 +3437,9 @@
       <w:pPr>
         <w:pStyle w:val="Heading4"/>
       </w:pPr>
-      <w:bookmarkStart w:id="29" w:name="why-random-rotation"/>
+      <w:bookmarkStart w:id="31" w:name="why-random-rotation"/>
       <w:r>
         <w:t xml:space="preserve">Why random rotation?</w:t>
-      </w:r>
-      <w:bookmarkEnd w:id="29"/>
-    </w:p>
-    <w:p>
-      <w:pPr>
-        <w:pStyle w:val="FirstParagraph"/>
-      </w:pPr>
-      <w:r>
-        <w:t xml:space="preserve">Random rotation is a form of the Johnson-Lindenstrauss transform and has the effect of making the quantization error distribution approximately uniform across coordinates. Without rotation, natural KV vectors often concentrate mass along a small set of channels; the Lloyd-Max codebook, which targets a single Beta distribution, would then be grossly misspecified for those channels.</w:t>
-      </w:r>
-    </w:p>
-    <w:p>
-      <w:pPr>
-        <w:pStyle w:val="Heading4"/>
-      </w:pPr>
-      <w:bookmarkStart w:id="30" w:name="why-not-qjl"/>
-      <w:r>
-        <w:t xml:space="preserve">Why not QJL?</w:t>
-      </w:r>
-      <w:bookmarkEnd w:id="30"/>
-    </w:p>
-    <w:p>
-      <w:pPr>
-        <w:pStyle w:val="FirstParagraph"/>
-      </w:pPr>
-      <w:r>
-        <w:t xml:space="preserve">The original TurboQuant paper proposes a second stage that replaces the Lloyd-Max indices with a Quantized Johnson-Lindenstrauss (QJL) sketch for additional compression. Community replication (and our own preliminary experiments) confirmed that this second stage damages downstream quality, because softmax attention amplifies any low-rank noise introduced by the sketch. We therefore work exclusively with MSE-only TurboQuant as our baseline, which we refer to as TurboQuant-V3.</w:t>
-      </w:r>
-    </w:p>
-    <w:p>
-      <w:pPr>
-        <w:pStyle w:val="Heading1"/>
-      </w:pPr>
-      <w:bookmarkStart w:id="31" w:name="sec:method"/>
-      <w:r>
-        <w:t xml:space="preserve">Method</w:t>
       </w:r>
       <w:bookmarkEnd w:id="31"/>
     </w:p>
@@ -3364,18 +3448,54 @@
         <w:pStyle w:val="FirstParagraph"/>
       </w:pPr>
       <w:r>
-        <w:t xml:space="preserve">Our contributions are two pre-deployment analyses over a short calibration run (16 samples of 512 tokens) and two corresponding modifications to the TurboQuant compressor.</w:t>
+        <w:t xml:space="preserve">Random rotation is a form of the Johnson-Lindenstrauss transform and has the effect of making the quantization error distribution approximately uniform across coordinates. Without rotation, natural KV vectors often concentrate mass along a small set of channels; the Lloyd-Max codebook, which targets a single Beta distribution, would then be grossly misspecified for those channels.</w:t>
       </w:r>
     </w:p>
     <w:p>
       <w:pPr>
+        <w:pStyle w:val="Heading4"/>
+      </w:pPr>
+      <w:bookmarkStart w:id="32" w:name="why-not-qjl"/>
+      <w:r>
+        <w:t xml:space="preserve">Why not QJL?</w:t>
+      </w:r>
+      <w:bookmarkEnd w:id="32"/>
+    </w:p>
+    <w:p>
+      <w:pPr>
+        <w:pStyle w:val="FirstParagraph"/>
+      </w:pPr>
+      <w:r>
+        <w:t xml:space="preserve">The original TurboQuant paper proposes a second stage that replaces the Lloyd-Max indices with a Quantized Johnson-Lindenstrauss (QJL) sketch for additional compression. Community replication (and our own preliminary experiments) confirmed that this second stage damages downstream quality, because softmax attention amplifies any low-rank noise introduced by the sketch. We therefore work exclusively with MSE-only TurboQuant as our baseline, which we refer to as TurboQuant-V3.</w:t>
+      </w:r>
+    </w:p>
+    <w:p>
+      <w:pPr>
+        <w:pStyle w:val="Heading1"/>
+      </w:pPr>
+      <w:bookmarkStart w:id="33" w:name="sec:method"/>
+      <w:r>
+        <w:t xml:space="preserve">Method</w:t>
+      </w:r>
+      <w:bookmarkEnd w:id="33"/>
+    </w:p>
+    <w:p>
+      <w:pPr>
+        <w:pStyle w:val="FirstParagraph"/>
+      </w:pPr>
+      <w:r>
+        <w:t xml:space="preserve">Our contributions are two pre-deployment analyses over a short calibration run (16 samples of 512 tokens) and two corresponding modifications to the TurboQuant compressor.</w:t>
+      </w:r>
+    </w:p>
+    <w:p>
+      <w:pPr>
         <w:pStyle w:val="Heading2"/>
       </w:pPr>
-      <w:bookmarkStart w:id="32" w:name="sec:sensitivity"/>
+      <w:bookmarkStart w:id="34" w:name="sec:sensitivity"/>
       <w:r>
         <w:t xml:space="preserve">Sensitivity Profiling</w:t>
       </w:r>
-      <w:bookmarkEnd w:id="32"/>
+      <w:bookmarkEnd w:id="34"/>
     </w:p>
     <w:p>
       <w:pPr>
@@ -3994,11 +4114,11 @@
       <w:pPr>
         <w:pStyle w:val="Heading2"/>
       </w:pPr>
-      <w:bookmarkStart w:id="33" w:name="sec:adaptive"/>
+      <w:bookmarkStart w:id="35" w:name="sec:adaptive"/>
       <w:r>
         <w:t xml:space="preserve">Sensitivity-Adaptive Bit Allocation</w:t>
       </w:r>
-      <w:bookmarkEnd w:id="33"/>
+      <w:bookmarkEnd w:id="35"/>
     </w:p>
     <w:p>
       <w:pPr>
@@ -5099,11 +5219,11 @@
       <w:pPr>
         <w:pStyle w:val="Heading2"/>
       </w:pPr>
-      <w:bookmarkStart w:id="34" w:name="sec:outlier"/>
+      <w:bookmarkStart w:id="36" w:name="sec:outlier"/>
       <w:r>
         <w:t xml:space="preserve">Outlier-Aware Channel Grouping</w:t>
       </w:r>
-      <w:bookmarkEnd w:id="34"/>
+      <w:bookmarkEnd w:id="36"/>
     </w:p>
     <w:p>
       <w:pPr>
@@ -5546,11 +5666,11 @@
       <w:pPr>
         <w:pStyle w:val="Heading1"/>
       </w:pPr>
-      <w:bookmarkStart w:id="35" w:name="sec:theory"/>
+      <w:bookmarkStart w:id="37" w:name="sec:theory"/>
       <w:r>
         <w:t xml:space="preserve">Theoretical Analysis of GQA Amplification</w:t>
       </w:r>
-      <w:bookmarkEnd w:id="35"/>
+      <w:bookmarkEnd w:id="37"/>
     </w:p>
     <w:p>
       <w:pPr>
@@ -5646,11 +5766,11 @@
       <w:pPr>
         <w:pStyle w:val="Heading2"/>
       </w:pPr>
-      <w:bookmarkStart w:id="36" w:name="sec:theory-setup"/>
+      <w:bookmarkStart w:id="38" w:name="sec:theory-setup"/>
       <w:r>
         <w:t xml:space="preserve">Setup</w:t>
       </w:r>
-      <w:bookmarkEnd w:id="36"/>
+      <w:bookmarkEnd w:id="38"/>
     </w:p>
     <w:p>
       <w:pPr>
@@ -6731,11 +6851,11 @@
       <w:pPr>
         <w:pStyle w:val="Heading2"/>
       </w:pPr>
-      <w:bookmarkStart w:id="37" w:name="sec:theory-perquery"/>
+      <w:bookmarkStart w:id="39" w:name="sec:theory-perquery"/>
       <w:r>
         <w:t xml:space="preserve">Per-Query Perturbation Bound</w:t>
       </w:r>
-      <w:bookmarkEnd w:id="37"/>
+      <w:bookmarkEnd w:id="39"/>
     </w:p>
     <w:p>
       <w:pPr>
@@ -8305,11 +8425,11 @@
       <w:pPr>
         <w:pStyle w:val="Heading2"/>
       </w:pPr>
-      <w:bookmarkStart w:id="38" w:name="sec:theory-gqa"/>
+      <w:bookmarkStart w:id="40" w:name="sec:theory-gqa"/>
       <w:r>
         <w:t xml:space="preserve">GQA Aggregation</w:t>
       </w:r>
-      <w:bookmarkEnd w:id="38"/>
+      <w:bookmarkEnd w:id="40"/>
     </w:p>
     <w:p>
       <w:pPr>
@@ -8747,11 +8867,11 @@
       <w:pPr>
         <w:pStyle w:val="Heading4"/>
       </w:pPr>
-      <w:bookmarkStart w:id="39" w:name="case-1-vector-quantization-vq-errors."/>
+      <w:bookmarkStart w:id="41" w:name="case-1-vector-quantization-vq-errors."/>
       <w:r>
         <w:t xml:space="preserve">Case 1 — Vector-quantization (VQ) errors.</w:t>
       </w:r>
-      <w:bookmarkEnd w:id="39"/>
+      <w:bookmarkEnd w:id="41"/>
     </w:p>
     <w:p>
       <w:pPr>
@@ -9518,11 +9638,11 @@
       <w:pPr>
         <w:pStyle w:val="Heading4"/>
       </w:pPr>
-      <w:bookmarkStart w:id="40" w:name="X2d879e3a47c25cf3edc5d66d5618fb66d6c81ad"/>
+      <w:bookmarkStart w:id="42" w:name="X2d879e3a47c25cf3edc5d66d5618fb66d6c81ad"/>
       <w:r>
         <w:t xml:space="preserve">Case 2 — Per-channel scalar errors (KIVI-style).</w:t>
       </w:r>
-      <w:bookmarkEnd w:id="40"/>
+      <w:bookmarkEnd w:id="42"/>
     </w:p>
     <w:p>
       <w:pPr>
@@ -10003,11 +10123,11 @@
       <w:pPr>
         <w:pStyle w:val="Heading2"/>
       </w:pPr>
-      <w:bookmarkStart w:id="41" w:name="sec:theory-crossover"/>
+      <w:bookmarkStart w:id="43" w:name="sec:theory-crossover"/>
       <w:r>
         <w:t xml:space="preserve">Crossover Inequality</w:t>
       </w:r>
-      <w:bookmarkEnd w:id="41"/>
+      <w:bookmarkEnd w:id="43"/>
     </w:p>
     <w:p>
       <w:pPr>
@@ -10805,11 +10925,11 @@
       <w:pPr>
         <w:pStyle w:val="Heading2"/>
       </w:pPr>
-      <w:bookmarkStart w:id="42" w:name="sec:theory-limitations"/>
+      <w:bookmarkStart w:id="44" w:name="sec:theory-limitations"/>
       <w:r>
         <w:t xml:space="preserve">Limitations of the Analysis</w:t>
       </w:r>
-      <w:bookmarkEnd w:id="42"/>
+      <w:bookmarkEnd w:id="44"/>
     </w:p>
     <w:p>
       <w:pPr>
@@ -11024,424 +11144,424 @@
       <w:pPr>
         <w:pStyle w:val="Heading1"/>
       </w:pPr>
-      <w:bookmarkStart w:id="43" w:name="sec:experiments"/>
+      <w:bookmarkStart w:id="45" w:name="sec:experiments"/>
       <w:r>
         <w:t xml:space="preserve">Experiments</w:t>
-      </w:r>
-      <w:bookmarkEnd w:id="43"/>
-    </w:p>
-    <w:p>
-      <w:pPr>
-        <w:pStyle w:val="Heading2"/>
-      </w:pPr>
-      <w:bookmarkStart w:id="44" w:name="setup"/>
-      <w:r>
-        <w:t xml:space="preserve">Setup</w:t>
-      </w:r>
-      <w:bookmarkEnd w:id="44"/>
-    </w:p>
-    <w:p>
-      <w:pPr>
-        <w:pStyle w:val="Heading4"/>
-      </w:pPr>
-      <w:bookmarkStart w:id="45" w:name="models."/>
-      <w:r>
-        <w:t xml:space="preserve">Models.</w:t>
       </w:r>
       <w:bookmarkEnd w:id="45"/>
     </w:p>
     <w:p>
       <w:pPr>
-        <w:pStyle w:val="FirstParagraph"/>
-      </w:pPr>
-      <w:r>
-        <w:t xml:space="preserve">We evaluate on five open-weight LLMs spanning four GQA ratios: Gemma-3-27B-it (GQA</w:t>
-      </w:r>
-      <w:r>
-        <w:t xml:space="preserve"> </w:t>
-      </w:r>
-      <m:oMath>
-        <m:r>
-          <m:t>2</m:t>
-        </m:r>
-        <m:r>
-          <m:t>:</m:t>
-        </m:r>
-        <m:r>
-          <m:t>1</m:t>
-        </m:r>
-      </m:oMath>
-      <w:r>
-        <w:t xml:space="preserve">,</w:t>
-      </w:r>
-      <w:r>
-        <w:t xml:space="preserve"> </w:t>
-      </w:r>
-      <m:oMath>
-        <m:r>
-          <m:t>62</m:t>
-        </m:r>
-      </m:oMath>
-      <w:r>
-        <w:t xml:space="preserve"> </w:t>
-      </w:r>
-      <w:r>
-        <w:t xml:space="preserve">layers), Mistral-7B-Instruct-v0.3 (GQA</w:t>
-      </w:r>
-      <w:r>
-        <w:t xml:space="preserve"> </w:t>
-      </w:r>
-      <m:oMath>
-        <m:r>
-          <m:t>4</m:t>
-        </m:r>
-        <m:r>
-          <m:t>:</m:t>
-        </m:r>
-        <m:r>
-          <m:t>1</m:t>
-        </m:r>
-      </m:oMath>
-      <w:r>
-        <w:t xml:space="preserve">,</w:t>
-      </w:r>
-      <w:r>
-        <w:t xml:space="preserve"> </w:t>
-      </w:r>
-      <m:oMath>
-        <m:r>
-          <m:t>32</m:t>
-        </m:r>
-      </m:oMath>
-      <w:r>
-        <w:t xml:space="preserve"> </w:t>
-      </w:r>
-      <w:r>
-        <w:t xml:space="preserve">layers), Llama-3.1-8B-Instruct (GQA</w:t>
-      </w:r>
-      <w:r>
-        <w:t xml:space="preserve"> </w:t>
-      </w:r>
-      <m:oMath>
-        <m:r>
-          <m:t>4</m:t>
-        </m:r>
-        <m:r>
-          <m:t>:</m:t>
-        </m:r>
-        <m:r>
-          <m:t>1</m:t>
-        </m:r>
-      </m:oMath>
-      <w:r>
-        <w:t xml:space="preserve">,</w:t>
-      </w:r>
-      <w:r>
-        <w:t xml:space="preserve"> </w:t>
-      </w:r>
-      <m:oMath>
-        <m:r>
-          <m:t>32</m:t>
-        </m:r>
-      </m:oMath>
-      <w:r>
-        <w:t xml:space="preserve"> </w:t>
-      </w:r>
-      <w:r>
-        <w:t xml:space="preserve">layers), Qwen2.5-32B-Instruct (GQA</w:t>
-      </w:r>
-      <w:r>
-        <w:t xml:space="preserve"> </w:t>
-      </w:r>
-      <m:oMath>
-        <m:r>
-          <m:t>5</m:t>
-        </m:r>
-        <m:r>
-          <m:t>:</m:t>
-        </m:r>
-        <m:r>
-          <m:t>1</m:t>
-        </m:r>
-      </m:oMath>
-      <w:r>
-        <w:t xml:space="preserve">,</w:t>
-      </w:r>
-      <w:r>
-        <w:t xml:space="preserve"> </w:t>
-      </w:r>
-      <m:oMath>
-        <m:r>
-          <m:t>64</m:t>
-        </m:r>
-      </m:oMath>
-      <w:r>
-        <w:t xml:space="preserve"> </w:t>
-      </w:r>
-      <w:r>
-        <w:t xml:space="preserve">layers), and Qwen2.5-3B-Instruct (GQA</w:t>
-      </w:r>
-      <w:r>
-        <w:t xml:space="preserve"> </w:t>
-      </w:r>
-      <m:oMath>
-        <m:r>
-          <m:t>8</m:t>
-        </m:r>
-        <m:r>
-          <m:t>:</m:t>
-        </m:r>
-        <m:r>
-          <m:t>1</m:t>
-        </m:r>
-      </m:oMath>
-      <w:r>
-        <w:t xml:space="preserve">,</w:t>
-      </w:r>
-      <w:r>
-        <w:t xml:space="preserve"> </w:t>
-      </w:r>
-      <m:oMath>
-        <m:r>
-          <m:t>36</m:t>
-        </m:r>
-      </m:oMath>
-      <w:r>
-        <w:t xml:space="preserve"> </w:t>
-      </w:r>
-      <w:r>
-        <w:t xml:space="preserve">layers). All models are loaded in BF16 on</w:t>
-      </w:r>
-      <w:r>
-        <w:t xml:space="preserve"> </w:t>
-      </w:r>
-      <m:oMath>
-        <m:r>
-          <m:t>3</m:t>
-        </m:r>
-        <m:r>
-          <m:t>×</m:t>
-        </m:r>
-      </m:oMath>
-      <w:r>
-        <w:t xml:space="preserve"> </w:t>
-      </w:r>
-      <w:r>
-        <w:t xml:space="preserve">NVIDIA RTX A6000 (</w:t>
-      </w:r>
-      <m:oMath>
-        <m:r>
-          <m:t>48</m:t>
-        </m:r>
-      </m:oMath>
-      <w:r>
-        <w:t xml:space="preserve"> </w:t>
-      </w:r>
-      <w:r>
-        <w:t xml:space="preserve">GB each,</w:t>
-      </w:r>
-      <w:r>
-        <w:t xml:space="preserve"> </w:t>
-      </w:r>
-      <m:oMath>
-        <m:r>
-          <m:t>144</m:t>
-        </m:r>
-      </m:oMath>
-      <w:r>
-        <w:t xml:space="preserve"> </w:t>
-      </w:r>
-      <w:r>
-        <w:t xml:space="preserve">GB aggregate VRAM). Qwen2.5-32B serves as our mid-to-large representative at the intermediate GQA</w:t>
-      </w:r>
-      <w:r>
-        <w:t xml:space="preserve"> </w:t>
-      </w:r>
-      <m:oMath>
-        <m:r>
-          <m:t>5</m:t>
-        </m:r>
-        <m:r>
-          <m:t>:</m:t>
-        </m:r>
-        <m:r>
-          <m:t>1</m:t>
-        </m:r>
-      </m:oMath>
-      <w:r>
-        <w:t xml:space="preserve"> </w:t>
-      </w:r>
-      <w:r>
-        <w:t xml:space="preserve">ratio that fills the gap between the standard</w:t>
-      </w:r>
-      <w:r>
-        <w:t xml:space="preserve"> </w:t>
-      </w:r>
-      <m:oMath>
-        <m:r>
-          <m:t>4</m:t>
-        </m:r>
-        <m:r>
-          <m:t>:</m:t>
-        </m:r>
-        <m:r>
-          <m:t>1</m:t>
-        </m:r>
-      </m:oMath>
-      <w:r>
-        <w:t xml:space="preserve"> </w:t>
-      </w:r>
-      <w:r>
-        <w:t xml:space="preserve">models and the aggressive</w:t>
-      </w:r>
-      <w:r>
-        <w:t xml:space="preserve"> </w:t>
-      </w:r>
-      <m:oMath>
-        <m:r>
-          <m:t>8</m:t>
-        </m:r>
-        <m:r>
-          <m:t>:</m:t>
-        </m:r>
-        <m:r>
-          <m:t>1</m:t>
-        </m:r>
-      </m:oMath>
-      <w:r>
-        <w:t xml:space="preserve"> </w:t>
-      </w:r>
-      <w:r>
-        <w:t xml:space="preserve">configuration of Qwen2.5-3B. As a supplementary point, we also report an FP16 baseline on Llama-3.1-70B-Instruct (GQA</w:t>
-      </w:r>
-      <w:r>
-        <w:t xml:space="preserve"> </w:t>
-      </w:r>
-      <m:oMath>
-        <m:r>
-          <m:t>8</m:t>
-        </m:r>
-        <m:r>
-          <m:t>:</m:t>
-        </m:r>
-        <m:r>
-          <m:t>1</m:t>
-        </m:r>
-      </m:oMath>
-      <w:r>
-        <w:t xml:space="preserve">,</w:t>
-      </w:r>
-      <w:r>
-        <w:t xml:space="preserve"> </w:t>
-      </w:r>
-      <m:oMath>
-        <m:r>
-          <m:t>80</m:t>
-        </m:r>
-      </m:oMath>
-      <w:r>
-        <w:t xml:space="preserve"> </w:t>
-      </w:r>
-      <w:r>
-        <w:t xml:space="preserve">layers) that we measured before memory pressure during compressed inference forced us to drop it from the main sweep.</w:t>
-      </w:r>
-    </w:p>
-    <w:p>
-      <w:pPr>
-        <w:pStyle w:val="Heading4"/>
-      </w:pPr>
-      <w:bookmarkStart w:id="46" w:name="baselines."/>
-      <w:r>
-        <w:t xml:space="preserve">Baselines.</w:t>
+        <w:pStyle w:val="Heading2"/>
+      </w:pPr>
+      <w:bookmarkStart w:id="46" w:name="setup"/>
+      <w:r>
+        <w:t xml:space="preserve">Setup</w:t>
       </w:r>
       <w:bookmarkEnd w:id="46"/>
     </w:p>
     <w:p>
       <w:pPr>
-        <w:pStyle w:val="FirstParagraph"/>
-      </w:pPr>
-      <w:r>
-        <w:t xml:space="preserve">We compare against FP16 (uncompressed), KIVI at</w:t>
-      </w:r>
-      <w:r>
-        <w:t xml:space="preserve"> </w:t>
-      </w:r>
-      <m:oMath>
-        <m:r>
-          <m:t>{</m:t>
-        </m:r>
-        <m:r>
-          <m:t>2</m:t>
-        </m:r>
-        <m:r>
-          <m:t>,</m:t>
-        </m:r>
-        <m:r>
-          <m:t>4</m:t>
-        </m:r>
-        <m:r>
-          <m:t>,</m:t>
-        </m:r>
-        <m:r>
-          <m:t>6</m:t>
-        </m:r>
-        <m:r>
-          <m:t>}</m:t>
-        </m:r>
-      </m:oMath>
-      <w:r>
-        <w:t xml:space="preserve"> </w:t>
-      </w:r>
-      <w:r>
-        <w:t xml:space="preserve">bits, and TurboQuant-V3 at various</w:t>
-      </w:r>
-      <w:r>
-        <w:t xml:space="preserve"> </w:t>
-      </w:r>
-      <m:oMath>
-        <m:r>
-          <m:t>(</m:t>
-        </m:r>
-        <m:r>
-          <m:t>K</m:t>
-        </m:r>
-        <m:r>
-          <m:t>,</m:t>
-        </m:r>
-        <m:r>
-          <m:t>V</m:t>
-        </m:r>
-        <m:r>
-          <m:t>)</m:t>
-        </m:r>
-      </m:oMath>
-      <w:r>
-        <w:t xml:space="preserve"> </w:t>
-      </w:r>
-      <w:r>
-        <w:t xml:space="preserve">bit-width pairs. KIVI and TurboQuant both use a</w:t>
-      </w:r>
-      <w:r>
-        <w:t xml:space="preserve"> </w:t>
-      </w:r>
-      <m:oMath>
-        <m:r>
-          <m:t>128</m:t>
-        </m:r>
-      </m:oMath>
-      <w:r>
-        <w:t xml:space="preserve">-token residual window in FP16 (so recent tokens are never compressed) for fair comparison.</w:t>
-      </w:r>
+        <w:pStyle w:val="Heading4"/>
+      </w:pPr>
+      <w:bookmarkStart w:id="47" w:name="models."/>
+      <w:r>
+        <w:t xml:space="preserve">Models.</w:t>
+      </w:r>
+      <w:bookmarkEnd w:id="47"/>
     </w:p>
     <w:p>
       <w:pPr>
+        <w:pStyle w:val="FirstParagraph"/>
+      </w:pPr>
+      <w:r>
+        <w:t xml:space="preserve">We evaluate on five open-weight LLMs spanning four GQA ratios: Gemma-3-27B-it (GQA</w:t>
+      </w:r>
+      <w:r>
+        <w:t xml:space="preserve"> </w:t>
+      </w:r>
+      <m:oMath>
+        <m:r>
+          <m:t>2</m:t>
+        </m:r>
+        <m:r>
+          <m:t>:</m:t>
+        </m:r>
+        <m:r>
+          <m:t>1</m:t>
+        </m:r>
+      </m:oMath>
+      <w:r>
+        <w:t xml:space="preserve">,</w:t>
+      </w:r>
+      <w:r>
+        <w:t xml:space="preserve"> </w:t>
+      </w:r>
+      <m:oMath>
+        <m:r>
+          <m:t>62</m:t>
+        </m:r>
+      </m:oMath>
+      <w:r>
+        <w:t xml:space="preserve"> </w:t>
+      </w:r>
+      <w:r>
+        <w:t xml:space="preserve">layers), Mistral-7B-Instruct-v0.3 (GQA</w:t>
+      </w:r>
+      <w:r>
+        <w:t xml:space="preserve"> </w:t>
+      </w:r>
+      <m:oMath>
+        <m:r>
+          <m:t>4</m:t>
+        </m:r>
+        <m:r>
+          <m:t>:</m:t>
+        </m:r>
+        <m:r>
+          <m:t>1</m:t>
+        </m:r>
+      </m:oMath>
+      <w:r>
+        <w:t xml:space="preserve">,</w:t>
+      </w:r>
+      <w:r>
+        <w:t xml:space="preserve"> </w:t>
+      </w:r>
+      <m:oMath>
+        <m:r>
+          <m:t>32</m:t>
+        </m:r>
+      </m:oMath>
+      <w:r>
+        <w:t xml:space="preserve"> </w:t>
+      </w:r>
+      <w:r>
+        <w:t xml:space="preserve">layers), Llama-3.1-8B-Instruct (GQA</w:t>
+      </w:r>
+      <w:r>
+        <w:t xml:space="preserve"> </w:t>
+      </w:r>
+      <m:oMath>
+        <m:r>
+          <m:t>4</m:t>
+        </m:r>
+        <m:r>
+          <m:t>:</m:t>
+        </m:r>
+        <m:r>
+          <m:t>1</m:t>
+        </m:r>
+      </m:oMath>
+      <w:r>
+        <w:t xml:space="preserve">,</w:t>
+      </w:r>
+      <w:r>
+        <w:t xml:space="preserve"> </w:t>
+      </w:r>
+      <m:oMath>
+        <m:r>
+          <m:t>32</m:t>
+        </m:r>
+      </m:oMath>
+      <w:r>
+        <w:t xml:space="preserve"> </w:t>
+      </w:r>
+      <w:r>
+        <w:t xml:space="preserve">layers), Qwen2.5-32B-Instruct (GQA</w:t>
+      </w:r>
+      <w:r>
+        <w:t xml:space="preserve"> </w:t>
+      </w:r>
+      <m:oMath>
+        <m:r>
+          <m:t>5</m:t>
+        </m:r>
+        <m:r>
+          <m:t>:</m:t>
+        </m:r>
+        <m:r>
+          <m:t>1</m:t>
+        </m:r>
+      </m:oMath>
+      <w:r>
+        <w:t xml:space="preserve">,</w:t>
+      </w:r>
+      <w:r>
+        <w:t xml:space="preserve"> </w:t>
+      </w:r>
+      <m:oMath>
+        <m:r>
+          <m:t>64</m:t>
+        </m:r>
+      </m:oMath>
+      <w:r>
+        <w:t xml:space="preserve"> </w:t>
+      </w:r>
+      <w:r>
+        <w:t xml:space="preserve">layers), and Qwen2.5-3B-Instruct (GQA</w:t>
+      </w:r>
+      <w:r>
+        <w:t xml:space="preserve"> </w:t>
+      </w:r>
+      <m:oMath>
+        <m:r>
+          <m:t>8</m:t>
+        </m:r>
+        <m:r>
+          <m:t>:</m:t>
+        </m:r>
+        <m:r>
+          <m:t>1</m:t>
+        </m:r>
+      </m:oMath>
+      <w:r>
+        <w:t xml:space="preserve">,</w:t>
+      </w:r>
+      <w:r>
+        <w:t xml:space="preserve"> </w:t>
+      </w:r>
+      <m:oMath>
+        <m:r>
+          <m:t>36</m:t>
+        </m:r>
+      </m:oMath>
+      <w:r>
+        <w:t xml:space="preserve"> </w:t>
+      </w:r>
+      <w:r>
+        <w:t xml:space="preserve">layers). All models are loaded in BF16 on</w:t>
+      </w:r>
+      <w:r>
+        <w:t xml:space="preserve"> </w:t>
+      </w:r>
+      <m:oMath>
+        <m:r>
+          <m:t>3</m:t>
+        </m:r>
+        <m:r>
+          <m:t>×</m:t>
+        </m:r>
+      </m:oMath>
+      <w:r>
+        <w:t xml:space="preserve"> </w:t>
+      </w:r>
+      <w:r>
+        <w:t xml:space="preserve">NVIDIA RTX A6000 (</w:t>
+      </w:r>
+      <m:oMath>
+        <m:r>
+          <m:t>48</m:t>
+        </m:r>
+      </m:oMath>
+      <w:r>
+        <w:t xml:space="preserve"> </w:t>
+      </w:r>
+      <w:r>
+        <w:t xml:space="preserve">GB each,</w:t>
+      </w:r>
+      <w:r>
+        <w:t xml:space="preserve"> </w:t>
+      </w:r>
+      <m:oMath>
+        <m:r>
+          <m:t>144</m:t>
+        </m:r>
+      </m:oMath>
+      <w:r>
+        <w:t xml:space="preserve"> </w:t>
+      </w:r>
+      <w:r>
+        <w:t xml:space="preserve">GB aggregate VRAM). Qwen2.5-32B serves as our mid-to-large representative at the intermediate GQA</w:t>
+      </w:r>
+      <w:r>
+        <w:t xml:space="preserve"> </w:t>
+      </w:r>
+      <m:oMath>
+        <m:r>
+          <m:t>5</m:t>
+        </m:r>
+        <m:r>
+          <m:t>:</m:t>
+        </m:r>
+        <m:r>
+          <m:t>1</m:t>
+        </m:r>
+      </m:oMath>
+      <w:r>
+        <w:t xml:space="preserve"> </w:t>
+      </w:r>
+      <w:r>
+        <w:t xml:space="preserve">ratio that fills the gap between the standard</w:t>
+      </w:r>
+      <w:r>
+        <w:t xml:space="preserve"> </w:t>
+      </w:r>
+      <m:oMath>
+        <m:r>
+          <m:t>4</m:t>
+        </m:r>
+        <m:r>
+          <m:t>:</m:t>
+        </m:r>
+        <m:r>
+          <m:t>1</m:t>
+        </m:r>
+      </m:oMath>
+      <w:r>
+        <w:t xml:space="preserve"> </w:t>
+      </w:r>
+      <w:r>
+        <w:t xml:space="preserve">models and the aggressive</w:t>
+      </w:r>
+      <w:r>
+        <w:t xml:space="preserve"> </w:t>
+      </w:r>
+      <m:oMath>
+        <m:r>
+          <m:t>8</m:t>
+        </m:r>
+        <m:r>
+          <m:t>:</m:t>
+        </m:r>
+        <m:r>
+          <m:t>1</m:t>
+        </m:r>
+      </m:oMath>
+      <w:r>
+        <w:t xml:space="preserve"> </w:t>
+      </w:r>
+      <w:r>
+        <w:t xml:space="preserve">configuration of Qwen2.5-3B. As a supplementary point, we also report an FP16 baseline on Llama-3.1-70B-Instruct (GQA</w:t>
+      </w:r>
+      <w:r>
+        <w:t xml:space="preserve"> </w:t>
+      </w:r>
+      <m:oMath>
+        <m:r>
+          <m:t>8</m:t>
+        </m:r>
+        <m:r>
+          <m:t>:</m:t>
+        </m:r>
+        <m:r>
+          <m:t>1</m:t>
+        </m:r>
+      </m:oMath>
+      <w:r>
+        <w:t xml:space="preserve">,</w:t>
+      </w:r>
+      <w:r>
+        <w:t xml:space="preserve"> </w:t>
+      </w:r>
+      <m:oMath>
+        <m:r>
+          <m:t>80</m:t>
+        </m:r>
+      </m:oMath>
+      <w:r>
+        <w:t xml:space="preserve"> </w:t>
+      </w:r>
+      <w:r>
+        <w:t xml:space="preserve">layers) that we measured before memory pressure during compressed inference forced us to drop it from the main sweep.</w:t>
+      </w:r>
+    </w:p>
+    <w:p>
+      <w:pPr>
         <w:pStyle w:val="Heading4"/>
       </w:pPr>
-      <w:bookmarkStart w:id="47" w:name="benchmarks."/>
+      <w:bookmarkStart w:id="48" w:name="baselines."/>
+      <w:r>
+        <w:t xml:space="preserve">Baselines.</w:t>
+      </w:r>
+      <w:bookmarkEnd w:id="48"/>
+    </w:p>
+    <w:p>
+      <w:pPr>
+        <w:pStyle w:val="FirstParagraph"/>
+      </w:pPr>
+      <w:r>
+        <w:t xml:space="preserve">We compare against FP16 (uncompressed), KIVI at</w:t>
+      </w:r>
+      <w:r>
+        <w:t xml:space="preserve"> </w:t>
+      </w:r>
+      <m:oMath>
+        <m:r>
+          <m:t>{</m:t>
+        </m:r>
+        <m:r>
+          <m:t>2</m:t>
+        </m:r>
+        <m:r>
+          <m:t>,</m:t>
+        </m:r>
+        <m:r>
+          <m:t>4</m:t>
+        </m:r>
+        <m:r>
+          <m:t>,</m:t>
+        </m:r>
+        <m:r>
+          <m:t>6</m:t>
+        </m:r>
+        <m:r>
+          <m:t>}</m:t>
+        </m:r>
+      </m:oMath>
+      <w:r>
+        <w:t xml:space="preserve"> </w:t>
+      </w:r>
+      <w:r>
+        <w:t xml:space="preserve">bits, and TurboQuant-V3 at various</w:t>
+      </w:r>
+      <w:r>
+        <w:t xml:space="preserve"> </w:t>
+      </w:r>
+      <m:oMath>
+        <m:r>
+          <m:t>(</m:t>
+        </m:r>
+        <m:r>
+          <m:t>K</m:t>
+        </m:r>
+        <m:r>
+          <m:t>,</m:t>
+        </m:r>
+        <m:r>
+          <m:t>V</m:t>
+        </m:r>
+        <m:r>
+          <m:t>)</m:t>
+        </m:r>
+      </m:oMath>
+      <w:r>
+        <w:t xml:space="preserve"> </w:t>
+      </w:r>
+      <w:r>
+        <w:t xml:space="preserve">bit-width pairs. KIVI and TurboQuant both use a</w:t>
+      </w:r>
+      <w:r>
+        <w:t xml:space="preserve"> </w:t>
+      </w:r>
+      <m:oMath>
+        <m:r>
+          <m:t>128</m:t>
+        </m:r>
+      </m:oMath>
+      <w:r>
+        <w:t xml:space="preserve">-token residual window in FP16 (so recent tokens are never compressed) for fair comparison.</w:t>
+      </w:r>
+    </w:p>
+    <w:p>
+      <w:pPr>
+        <w:pStyle w:val="Heading4"/>
+      </w:pPr>
+      <w:bookmarkStart w:id="49" w:name="benchmarks."/>
       <w:r>
         <w:t xml:space="preserve">Benchmarks.</w:t>
       </w:r>
-      <w:bookmarkEnd w:id="47"/>
+      <w:bookmarkEnd w:id="49"/>
     </w:p>
     <w:p>
       <w:pPr>
@@ -11611,11 +11731,11 @@
       <w:pPr>
         <w:pStyle w:val="Heading2"/>
       </w:pPr>
-      <w:bookmarkStart w:id="48" w:name="sec:main-ppl"/>
+      <w:bookmarkStart w:id="50" w:name="sec:main-ppl"/>
       <w:r>
         <w:t xml:space="preserve">Main Results: Perplexity</w:t>
       </w:r>
-      <w:bookmarkEnd w:id="48"/>
+      <w:bookmarkEnd w:id="50"/>
     </w:p>
     <w:p>
       <w:pPr>
@@ -11639,7 +11759,7 @@
         <w:t xml:space="preserve">shows WikiText-2 perplexity across all four evaluated models and the standard bit-width settings. Three observations are immediate.</w:t>
       </w:r>
     </w:p>
-    <w:bookmarkStart w:id="49" w:name="tab:main-ppl"/>
+    <w:bookmarkStart w:id="51" w:name="tab:main-ppl"/>
     <w:p>
       <w:pPr>
         <w:pStyle w:val="TableCaption"/>
@@ -12415,7 +12535,7 @@
         </w:tc>
       </w:tr>
     </w:tbl>
-    <w:bookmarkEnd w:id="49"/>
+    <w:bookmarkEnd w:id="51"/>
     <w:p>
       <w:pPr>
         <w:pStyle w:val="BodyText"/>
@@ -12726,13 +12846,13 @@
       <w:pPr>
         <w:pStyle w:val="Heading2"/>
       </w:pPr>
-      <w:bookmarkStart w:id="50" w:name="sec:qwen-rescue"/>
+      <w:bookmarkStart w:id="52" w:name="sec:qwen-rescue"/>
       <w:r>
         <w:t xml:space="preserve">Rescuing Qwen2.5-3B with Adaptive and Outlier-Aware Methods</w:t>
       </w:r>
-      <w:bookmarkEnd w:id="50"/>
+      <w:bookmarkEnd w:id="52"/>
     </w:p>
-    <w:bookmarkStart w:id="51" w:name="tab:qwen-rescue"/>
+    <w:bookmarkStart w:id="53" w:name="tab:qwen-rescue"/>
     <w:p>
       <w:pPr>
         <w:pStyle w:val="TableCaption"/>
@@ -13695,7 +13815,7 @@
         </w:tc>
       </w:tr>
     </w:tbl>
-    <w:bookmarkEnd w:id="51"/>
+    <w:bookmarkEnd w:id="53"/>
     <w:p>
       <w:pPr>
         <w:pStyle w:val="BodyText"/>
@@ -14125,17 +14245,17 @@
       <w:pPr>
         <w:pStyle w:val="Heading2"/>
       </w:pPr>
-      <w:bookmarkStart w:id="52" w:name="sec:sensitivity-analysis"/>
+      <w:bookmarkStart w:id="54" w:name="sec:sensitivity-analysis"/>
       <w:r>
         <w:t xml:space="preserve">Sensitivity Analysis</w:t>
       </w:r>
-      <w:bookmarkEnd w:id="52"/>
+      <w:bookmarkEnd w:id="54"/>
     </w:p>
     <w:p>
       <w:pPr>
         <w:pStyle w:val="CaptionedFigure"/>
       </w:pPr>
-      <w:bookmarkStart w:id="54" w:name="fig:sensitivity"/>
+      <w:bookmarkStart w:id="56" w:name="fig:sensitivity"/>
       <w:r>
         <w:drawing>
           <wp:inline>
@@ -14152,7 +14272,7 @@
                     </pic:cNvPicPr>
                   </pic:nvPicPr>
                   <pic:blipFill>
-                    <a:blip r:embed="rId53"/>
+                    <a:blip r:embed="rId55"/>
                     <a:stretch>
                       <a:fillRect/>
                     </a:stretch>
@@ -14178,7 +14298,7 @@
           </wp:inline>
         </w:drawing>
       </w:r>
-      <w:bookmarkEnd w:id="54"/>
+      <w:bookmarkEnd w:id="56"/>
     </w:p>
     <w:p>
       <w:pPr>
@@ -14352,7 +14472,7 @@
           <w:rPr>
             <w:rStyle w:val="Hyperlink"/>
           </w:rPr>
-          <w:t xml:space="preserve">1</w:t>
+          <w:t xml:space="preserve">2</w:t>
         </w:r>
       </w:hyperlink>
       <w:r>
@@ -14515,13 +14635,13 @@
       <w:pPr>
         <w:pStyle w:val="Heading2"/>
       </w:pPr>
-      <w:bookmarkStart w:id="55" w:name="sec:needle"/>
+      <w:bookmarkStart w:id="57" w:name="sec:needle"/>
       <w:r>
         <w:t xml:space="preserve">Needle-in-a-Haystack</w:t>
       </w:r>
-      <w:bookmarkEnd w:id="55"/>
+      <w:bookmarkEnd w:id="57"/>
     </w:p>
-    <w:bookmarkStart w:id="56" w:name="tab:needle"/>
+    <w:bookmarkStart w:id="58" w:name="tab:needle"/>
     <w:p>
       <w:pPr>
         <w:pStyle w:val="TableCaption"/>
@@ -14839,7 +14959,7 @@
         </w:tc>
       </w:tr>
     </w:tbl>
-    <w:bookmarkEnd w:id="56"/>
+    <w:bookmarkEnd w:id="58"/>
     <w:p>
       <w:pPr>
         <w:pStyle w:val="BodyText"/>
@@ -14913,13 +15033,13 @@
       <w:pPr>
         <w:pStyle w:val="Heading2"/>
       </w:pPr>
-      <w:bookmarkStart w:id="57" w:name="sec:hardware"/>
+      <w:bookmarkStart w:id="59" w:name="sec:hardware"/>
       <w:r>
         <w:t xml:space="preserve">Hardware Latency and Memory</w:t>
       </w:r>
-      <w:bookmarkEnd w:id="57"/>
+      <w:bookmarkEnd w:id="59"/>
     </w:p>
-    <w:bookmarkStart w:id="58" w:name="tab:hw"/>
+    <w:bookmarkStart w:id="60" w:name="tab:hw"/>
     <w:p>
       <w:pPr>
         <w:pStyle w:val="TableCaption"/>
@@ -15721,7 +15841,7 @@
         </w:tc>
       </w:tr>
     </w:tbl>
-    <w:bookmarkEnd w:id="58"/>
+    <w:bookmarkEnd w:id="60"/>
     <w:p>
       <w:pPr>
         <w:pStyle w:val="BodyText"/>
@@ -15847,21 +15967,21 @@
       <w:pPr>
         <w:pStyle w:val="Heading1"/>
       </w:pPr>
-      <w:bookmarkStart w:id="59" w:name="sec:discussion"/>
+      <w:bookmarkStart w:id="61" w:name="sec:discussion"/>
       <w:r>
         <w:t xml:space="preserve">Discussion</w:t>
       </w:r>
-      <w:bookmarkEnd w:id="59"/>
+      <w:bookmarkEnd w:id="61"/>
     </w:p>
     <w:p>
       <w:pPr>
         <w:pStyle w:val="Heading4"/>
       </w:pPr>
-      <w:bookmarkStart w:id="60" w:name="X3efb250ab63edafddc268b83b287725c39dd13a"/>
+      <w:bookmarkStart w:id="62" w:name="X3efb250ab63edafddc268b83b287725c39dd13a"/>
       <w:r>
         <w:t xml:space="preserve">Why does GQA amplify VQ error specifically?</w:t>
       </w:r>
-      <w:bookmarkEnd w:id="60"/>
+      <w:bookmarkEnd w:id="62"/>
     </w:p>
     <w:p>
       <w:pPr>
@@ -15961,7 +16081,7 @@
       <w:pPr>
         <w:pStyle w:val="Heading4"/>
       </w:pPr>
-      <w:bookmarkStart w:id="61" w:name="why-is-layer-0-special"/>
+      <w:bookmarkStart w:id="63" w:name="why-is-layer-0-special"/>
       <w:r>
         <w:t xml:space="preserve">Why is layer</w:t>
       </w:r>
@@ -15978,170 +16098,6 @@
       </w:r>
       <w:r>
         <w:t xml:space="preserve">special?</w:t>
-      </w:r>
-      <w:bookmarkEnd w:id="61"/>
-    </w:p>
-    <w:p>
-      <w:pPr>
-        <w:pStyle w:val="FirstParagraph"/>
-      </w:pPr>
-      <w:r>
-        <w:t xml:space="preserve">Across all models we profiled, layer</w:t>
-      </w:r>
-      <w:r>
-        <w:t xml:space="preserve"> </w:t>
-      </w:r>
-      <m:oMath>
-        <m:r>
-          <m:t>0</m:t>
-        </m:r>
-      </m:oMath>
-      <w:r>
-        <w:t xml:space="preserve"> </w:t>
-      </w:r>
-      <w:r>
-        <w:t xml:space="preserve">keys are significantly more sensitive than keys in subsequent layers. This is consistent with the intuition that layer</w:t>
-      </w:r>
-      <w:r>
-        <w:t xml:space="preserve"> </w:t>
-      </w:r>
-      <m:oMath>
-        <m:r>
-          <m:t>0</m:t>
-        </m:r>
-      </m:oMath>
-      <w:r>
-        <w:t xml:space="preserve"> </w:t>
-      </w:r>
-      <w:r>
-        <w:t xml:space="preserve">performs the</w:t>
-      </w:r>
-      <w:r>
-        <w:t xml:space="preserve"> </w:t>
-      </w:r>
-      <w:r>
-        <w:t xml:space="preserve">“</w:t>
-      </w:r>
-      <w:r>
-        <w:t xml:space="preserve">token classification</w:t>
-      </w:r>
-      <w:r>
-        <w:t xml:space="preserve">”</w:t>
-      </w:r>
-      <w:r>
-        <w:t xml:space="preserve"> </w:t>
-      </w:r>
-      <w:r>
-        <w:t xml:space="preserve">part of the forward pass: its keys directly reflect token-identity information that has not yet been contextualized, and disrupting this information ripples through every subsequent layer. Layers near the output (layers</w:t>
-      </w:r>
-      <w:r>
-        <w:t xml:space="preserve"> </w:t>
-      </w:r>
-      <m:oMath>
-        <m:r>
-          <m:t>28</m:t>
-        </m:r>
-      </m:oMath>
-      <w:r>
-        <w:t xml:space="preserve">–</w:t>
-      </w:r>
-      <m:oMath>
-        <m:r>
-          <m:t>31</m:t>
-        </m:r>
-      </m:oMath>
-      <w:r>
-        <w:t xml:space="preserve"> </w:t>
-      </w:r>
-      <w:r>
-        <w:t xml:space="preserve">on a</w:t>
-      </w:r>
-      <w:r>
-        <w:t xml:space="preserve"> </w:t>
-      </w:r>
-      <m:oMath>
-        <m:r>
-          <m:t>32</m:t>
-        </m:r>
-      </m:oMath>
-      <w:r>
-        <w:t xml:space="preserve">-layer model) show a milder but still visible spike on the value side, which we tentatively attribute to their role in producing the final next-token distribution.</w:t>
-      </w:r>
-    </w:p>
-    <w:p>
-      <w:pPr>
-        <w:pStyle w:val="Heading4"/>
-      </w:pPr>
-      <w:bookmarkStart w:id="62" w:name="X2800a59bc8c97c8791e724484c2c5de6b341b38"/>
-      <w:r>
-        <w:t xml:space="preserve">Interaction of adaptive allocation and outlier grouping.</w:t>
-      </w:r>
-      <w:bookmarkEnd w:id="62"/>
-    </w:p>
-    <w:p>
-      <w:pPr>
-        <w:pStyle w:val="FirstParagraph"/>
-      </w:pPr>
-      <w:r>
-        <w:t xml:space="preserve">Our combined</w:t>
-      </w:r>
-      <w:r>
-        <w:t xml:space="preserve"> </w:t>
-      </w:r>
-      <w:r>
-        <w:t xml:space="preserve">“</w:t>
-      </w:r>
-      <w:r>
-        <w:t xml:space="preserve">adaptive + outlier</w:t>
-      </w:r>
-      <w:r>
-        <w:t xml:space="preserve">”</w:t>
-      </w:r>
-      <w:r>
-        <w:t xml:space="preserve"> </w:t>
-      </w:r>
-      <w:r>
-        <w:t xml:space="preserve">experiment on Qwen2.5-3B did not strictly dominate outlier-only, suggesting the two techniques are partly redundant in their effects: both devote additional precision to the most damaging channels, but through different mechanisms. A more integrated allocator that is aware of the outlier overhead budget may recover the small gap; we leave this to future work. In the meantime, we recommend outlier-aware grouping as the default on GQA-</w:t>
-      </w:r>
-      <m:oMath>
-        <m:r>
-          <m:t>8</m:t>
-        </m:r>
-        <m:r>
-          <m:t>:</m:t>
-        </m:r>
-        <m:r>
-          <m:t>1</m:t>
-        </m:r>
-      </m:oMath>
-      <w:r>
-        <w:t xml:space="preserve"> </w:t>
-      </w:r>
-      <w:r>
-        <w:t xml:space="preserve">models and adaptive allocation as the default for budgets below</w:t>
-      </w:r>
-      <w:r>
-        <w:t xml:space="preserve"> </w:t>
-      </w:r>
-      <m:oMath>
-        <m:r>
-          <m:t>4</m:t>
-        </m:r>
-      </m:oMath>
-      <w:r>
-        <w:t xml:space="preserve"> </w:t>
-      </w:r>
-      <w:r>
-        <w:t xml:space="preserve">bits.</w:t>
-      </w:r>
-    </w:p>
-    <w:p>
-      <w:pPr>
-        <w:pStyle w:val="Heading4"/>
-      </w:pPr>
-      <w:bookmarkStart w:id="63" w:name="calibration-cost."/>
-      <w:r>
-        <w:t xml:space="preserve">Calibration cost.</w:t>
       </w:r>
       <w:bookmarkEnd w:id="63"/>
     </w:p>
@@ -16150,28 +16106,192 @@
         <w:pStyle w:val="FirstParagraph"/>
       </w:pPr>
       <w:r>
-        <w:t xml:space="preserve">Both our methods require a one-time offline calibration of roughly a minute per model. This is negligible compared to training or even fine-tuning costs, and the resulting sensitivity profile and outlier channel list are small enough to ship with model checkpoints.</w:t>
+        <w:t xml:space="preserve">Across all models we profiled, layer</w:t>
+      </w:r>
+      <w:r>
+        <w:t xml:space="preserve"> </w:t>
+      </w:r>
+      <m:oMath>
+        <m:r>
+          <m:t>0</m:t>
+        </m:r>
+      </m:oMath>
+      <w:r>
+        <w:t xml:space="preserve"> </w:t>
+      </w:r>
+      <w:r>
+        <w:t xml:space="preserve">keys are significantly more sensitive than keys in subsequent layers. This is consistent with the intuition that layer</w:t>
+      </w:r>
+      <w:r>
+        <w:t xml:space="preserve"> </w:t>
+      </w:r>
+      <m:oMath>
+        <m:r>
+          <m:t>0</m:t>
+        </m:r>
+      </m:oMath>
+      <w:r>
+        <w:t xml:space="preserve"> </w:t>
+      </w:r>
+      <w:r>
+        <w:t xml:space="preserve">performs the</w:t>
+      </w:r>
+      <w:r>
+        <w:t xml:space="preserve"> </w:t>
+      </w:r>
+      <w:r>
+        <w:t xml:space="preserve">“</w:t>
+      </w:r>
+      <w:r>
+        <w:t xml:space="preserve">token classification</w:t>
+      </w:r>
+      <w:r>
+        <w:t xml:space="preserve">”</w:t>
+      </w:r>
+      <w:r>
+        <w:t xml:space="preserve"> </w:t>
+      </w:r>
+      <w:r>
+        <w:t xml:space="preserve">part of the forward pass: its keys directly reflect token-identity information that has not yet been contextualized, and disrupting this information ripples through every subsequent layer. Layers near the output (layers</w:t>
+      </w:r>
+      <w:r>
+        <w:t xml:space="preserve"> </w:t>
+      </w:r>
+      <m:oMath>
+        <m:r>
+          <m:t>28</m:t>
+        </m:r>
+      </m:oMath>
+      <w:r>
+        <w:t xml:space="preserve">–</w:t>
+      </w:r>
+      <m:oMath>
+        <m:r>
+          <m:t>31</m:t>
+        </m:r>
+      </m:oMath>
+      <w:r>
+        <w:t xml:space="preserve"> </w:t>
+      </w:r>
+      <w:r>
+        <w:t xml:space="preserve">on a</w:t>
+      </w:r>
+      <w:r>
+        <w:t xml:space="preserve"> </w:t>
+      </w:r>
+      <m:oMath>
+        <m:r>
+          <m:t>32</m:t>
+        </m:r>
+      </m:oMath>
+      <w:r>
+        <w:t xml:space="preserve">-layer model) show a milder but still visible spike on the value side, which we tentatively attribute to their role in producing the final next-token distribution.</w:t>
       </w:r>
     </w:p>
     <w:p>
       <w:pPr>
-        <w:pStyle w:val="Heading1"/>
-      </w:pPr>
-      <w:bookmarkStart w:id="64" w:name="sec:limitations"/>
-      <w:r>
-        <w:t xml:space="preserve">Limitations</w:t>
+        <w:pStyle w:val="Heading4"/>
+      </w:pPr>
+      <w:bookmarkStart w:id="64" w:name="X2800a59bc8c97c8791e724484c2c5de6b341b38"/>
+      <w:r>
+        <w:t xml:space="preserve">Interaction of adaptive allocation and outlier grouping.</w:t>
       </w:r>
       <w:bookmarkEnd w:id="64"/>
     </w:p>
     <w:p>
       <w:pPr>
+        <w:pStyle w:val="FirstParagraph"/>
+      </w:pPr>
+      <w:r>
+        <w:t xml:space="preserve">Our combined</w:t>
+      </w:r>
+      <w:r>
+        <w:t xml:space="preserve"> </w:t>
+      </w:r>
+      <w:r>
+        <w:t xml:space="preserve">“</w:t>
+      </w:r>
+      <w:r>
+        <w:t xml:space="preserve">adaptive + outlier</w:t>
+      </w:r>
+      <w:r>
+        <w:t xml:space="preserve">”</w:t>
+      </w:r>
+      <w:r>
+        <w:t xml:space="preserve"> </w:t>
+      </w:r>
+      <w:r>
+        <w:t xml:space="preserve">experiment on Qwen2.5-3B did not strictly dominate outlier-only, suggesting the two techniques are partly redundant in their effects: both devote additional precision to the most damaging channels, but through different mechanisms. A more integrated allocator that is aware of the outlier overhead budget may recover the small gap; we leave this to future work. In the meantime, we recommend outlier-aware grouping as the default on GQA-</w:t>
+      </w:r>
+      <m:oMath>
+        <m:r>
+          <m:t>8</m:t>
+        </m:r>
+        <m:r>
+          <m:t>:</m:t>
+        </m:r>
+        <m:r>
+          <m:t>1</m:t>
+        </m:r>
+      </m:oMath>
+      <w:r>
+        <w:t xml:space="preserve"> </w:t>
+      </w:r>
+      <w:r>
+        <w:t xml:space="preserve">models and adaptive allocation as the default for budgets below</w:t>
+      </w:r>
+      <w:r>
+        <w:t xml:space="preserve"> </w:t>
+      </w:r>
+      <m:oMath>
+        <m:r>
+          <m:t>4</m:t>
+        </m:r>
+      </m:oMath>
+      <w:r>
+        <w:t xml:space="preserve"> </w:t>
+      </w:r>
+      <w:r>
+        <w:t xml:space="preserve">bits.</w:t>
+      </w:r>
+    </w:p>
+    <w:p>
+      <w:pPr>
         <w:pStyle w:val="Heading4"/>
       </w:pPr>
-      <w:bookmarkStart w:id="65" w:name="implementation-speed."/>
+      <w:bookmarkStart w:id="65" w:name="calibration-cost."/>
+      <w:r>
+        <w:t xml:space="preserve">Calibration cost.</w:t>
+      </w:r>
+      <w:bookmarkEnd w:id="65"/>
+    </w:p>
+    <w:p>
+      <w:pPr>
+        <w:pStyle w:val="FirstParagraph"/>
+      </w:pPr>
+      <w:r>
+        <w:t xml:space="preserve">Both our methods require a one-time offline calibration of roughly a minute per model. This is negligible compared to training or even fine-tuning costs, and the resulting sensitivity profile and outlier channel list are small enough to ship with model checkpoints.</w:t>
+      </w:r>
+    </w:p>
+    <w:p>
+      <w:pPr>
+        <w:pStyle w:val="Heading1"/>
+      </w:pPr>
+      <w:bookmarkStart w:id="66" w:name="sec:limitations"/>
+      <w:r>
+        <w:t xml:space="preserve">Limitations</w:t>
+      </w:r>
+      <w:bookmarkEnd w:id="66"/>
+    </w:p>
+    <w:p>
+      <w:pPr>
+        <w:pStyle w:val="Heading4"/>
+      </w:pPr>
+      <w:bookmarkStart w:id="67" w:name="implementation-speed."/>
       <w:r>
         <w:t xml:space="preserve">Implementation speed.</w:t>
       </w:r>
-      <w:bookmarkEnd w:id="65"/>
+      <w:bookmarkEnd w:id="67"/>
     </w:p>
     <w:p>
       <w:pPr>
@@ -16196,90 +16316,9 @@
       <w:pPr>
         <w:pStyle w:val="Heading4"/>
       </w:pPr>
-      <w:bookmarkStart w:id="66" w:name="llama-3.1-70b."/>
+      <w:bookmarkStart w:id="68" w:name="llama-3.1-70b."/>
       <w:r>
         <w:t xml:space="preserve">Llama-3.1-70B.</w:t>
-      </w:r>
-      <w:bookmarkEnd w:id="66"/>
-    </w:p>
-    <w:p>
-      <w:pPr>
-        <w:pStyle w:val="FirstParagraph"/>
-      </w:pPr>
-      <w:r>
-        <w:t xml:space="preserve">The 70B model’s weights alone consume almost all of our</w:t>
-      </w:r>
-      <w:r>
-        <w:t xml:space="preserve"> </w:t>
-      </w:r>
-      <m:oMath>
-        <m:r>
-          <m:t>144</m:t>
-        </m:r>
-      </m:oMath>
-      <w:r>
-        <w:t xml:space="preserve"> </w:t>
-      </w:r>
-      <w:r>
-        <w:t xml:space="preserve">GB VRAM in BF16. We were unable to run compressed inference on it because the decompression overhead of our reference implementation tips the peak memory past the available budget, producing OOM errors. We report only the FP16 baseline (</w:t>
-      </w:r>
-      <m:oMath>
-        <m:r>
-          <m:t>3.40</m:t>
-        </m:r>
-      </m:oMath>
-      <w:r>
-        <w:t xml:space="preserve"> </w:t>
-      </w:r>
-      <w:r>
-        <w:t xml:space="preserve">PPL on WikiText-2 at</w:t>
-      </w:r>
-      <w:r>
-        <w:t xml:space="preserve"> </w:t>
-      </w:r>
-      <m:oMath>
-        <m:r>
-          <m:t>2</m:t>
-        </m:r>
-        <m:r>
-          <m:t>,</m:t>
-        </m:r>
-        <m:r>
-          <m:t>048</m:t>
-        </m:r>
-      </m:oMath>
-      <w:r>
-        <w:t xml:space="preserve"> </w:t>
-      </w:r>
-      <w:r>
-        <w:t xml:space="preserve">tokens). A production implementation that decompresses in place would avoid this issue.</w:t>
-      </w:r>
-    </w:p>
-    <w:p>
-      <w:pPr>
-        <w:pStyle w:val="Heading4"/>
-      </w:pPr>
-      <w:bookmarkStart w:id="67" w:name="gemma-3-calibration."/>
-      <w:r>
-        <w:t xml:space="preserve">Gemma-3 calibration.</w:t>
-      </w:r>
-      <w:bookmarkEnd w:id="67"/>
-    </w:p>
-    <w:p>
-      <w:pPr>
-        <w:pStyle w:val="FirstParagraph"/>
-      </w:pPr>
-      <w:r>
-        <w:t xml:space="preserve">Our sensitivity profiler produces NaN values on the final layers of Gemma-3-27B, which we traced to the model’s mixed sliding/full attention layer structure interacting with our calibration harness. We worked around this by disabling adaptive allocation for Gemma-3 (all reported Gemma-3 results use uniform bit-widths), and the excellent near-lossless baseline performance indicates adaptive allocation is not needed there. Fixing the profiler for sliding-attention models is a direction for future work.</w:t>
-      </w:r>
-    </w:p>
-    <w:p>
-      <w:pPr>
-        <w:pStyle w:val="Heading4"/>
-      </w:pPr>
-      <w:bookmarkStart w:id="68" w:name="calibration-domain-sensitivity."/>
-      <w:r>
-        <w:t xml:space="preserve">Calibration domain sensitivity.</w:t>
       </w:r>
       <w:bookmarkEnd w:id="68"/>
     </w:p>
@@ -16288,32 +16327,171 @@
         <w:pStyle w:val="FirstParagraph"/>
       </w:pPr>
       <w:r>
-        <w:t xml:space="preserve">We use</w:t>
-      </w:r>
-      <w:r>
-        <w:t xml:space="preserve"> </w:t>
-      </w:r>
-      <m:oMath>
-        <m:r>
-          <m:t>16</m:t>
-        </m:r>
-      </m:oMath>
-      <w:r>
-        <w:t xml:space="preserve"> </w:t>
-      </w:r>
-      <w:r>
-        <w:t xml:space="preserve">samples from C4 or WikiText-2 for calibration. We have not studied how sensitive the resulting allocation is to calibration-domain mismatch; existing sensitivity-aware weight quantization work suggests it is fairly robust, but the question deserves direct study in the KV cache setting.</w:t>
+        <w:t xml:space="preserve">The 70B model’s weights alone consume almost all of our</w:t>
+      </w:r>
+      <w:r>
+        <w:t xml:space="preserve"> </w:t>
+      </w:r>
+      <m:oMath>
+        <m:r>
+          <m:t>144</m:t>
+        </m:r>
+      </m:oMath>
+      <w:r>
+        <w:t xml:space="preserve"> </w:t>
+      </w:r>
+      <w:r>
+        <w:t xml:space="preserve">GB VRAM in BF16. We were unable to run compressed inference on it because the decompression overhead of our reference implementation tips the peak memory past the available budget, producing OOM errors. We report only the FP16 baseline (</w:t>
+      </w:r>
+      <m:oMath>
+        <m:r>
+          <m:t>3.40</m:t>
+        </m:r>
+      </m:oMath>
+      <w:r>
+        <w:t xml:space="preserve"> </w:t>
+      </w:r>
+      <w:r>
+        <w:t xml:space="preserve">PPL on WikiText-2 at</w:t>
+      </w:r>
+      <w:r>
+        <w:t xml:space="preserve"> </w:t>
+      </w:r>
+      <m:oMath>
+        <m:r>
+          <m:t>2</m:t>
+        </m:r>
+        <m:r>
+          <m:t>,</m:t>
+        </m:r>
+        <m:r>
+          <m:t>048</m:t>
+        </m:r>
+      </m:oMath>
+      <w:r>
+        <w:t xml:space="preserve"> </w:t>
+      </w:r>
+      <w:r>
+        <w:t xml:space="preserve">tokens). A production implementation that decompresses in place would avoid this issue.</w:t>
       </w:r>
     </w:p>
     <w:p>
       <w:pPr>
+        <w:pStyle w:val="Heading4"/>
+      </w:pPr>
+      <w:bookmarkStart w:id="69" w:name="gemma-3-calibration."/>
+      <w:r>
+        <w:t xml:space="preserve">Gemma-3 calibration.</w:t>
+      </w:r>
+      <w:bookmarkEnd w:id="69"/>
+    </w:p>
+    <w:p>
+      <w:pPr>
+        <w:pStyle w:val="FirstParagraph"/>
+      </w:pPr>
+      <w:r>
+        <w:t xml:space="preserve">Gemma-3-27B has a mixed sliding/full attention structure that required a hook-based calibration path (hooking</w:t>
+      </w:r>
+      <w:r>
+        <w:t xml:space="preserve"> </w:t>
+      </w:r>
+      <w:r>
+        <w:rPr>
+          <w:rStyle w:val="VerbatimChar"/>
+        </w:rPr>
+        <w:t xml:space="preserve">k_proj</w:t>
+      </w:r>
+      <w:r>
+        <w:t xml:space="preserve">/</w:t>
+      </w:r>
+      <w:r>
+        <w:rPr>
+          <w:rStyle w:val="VerbatimChar"/>
+        </w:rPr>
+        <w:t xml:space="preserve">v_proj</w:t>
+      </w:r>
+      <w:r>
+        <w:t xml:space="preserve"> </w:t>
+      </w:r>
+      <w:r>
+        <w:t xml:space="preserve">directly) rather than reading from the cache. After this fix, all</w:t>
+      </w:r>
+      <w:r>
+        <w:t xml:space="preserve"> </w:t>
+      </w:r>
+      <m:oMath>
+        <m:r>
+          <m:t>62</m:t>
+        </m:r>
+      </m:oMath>
+      <w:r>
+        <w:t xml:space="preserve"> </w:t>
+      </w:r>
+      <w:r>
+        <w:t xml:space="preserve">layers produce finite sensitivity values and the adaptive allocator runs successfully, though the resulting allocation does not improve over uniform K4V4 since Gemma-3 is already near-lossless at</w:t>
+      </w:r>
+      <w:r>
+        <w:t xml:space="preserve"> </w:t>
+      </w:r>
+      <m:oMath>
+        <m:r>
+          <m:t>+</m:t>
+        </m:r>
+        <m:r>
+          <m:t>0.7</m:t>
+        </m:r>
+        <m:r>
+          <m:t>%</m:t>
+        </m:r>
+      </m:oMath>
+      <w:r>
+        <w:t xml:space="preserve"> </w:t>
+      </w:r>
+      <w:r>
+        <w:t xml:space="preserve">perplexity.</w:t>
+      </w:r>
+    </w:p>
+    <w:p>
+      <w:pPr>
+        <w:pStyle w:val="Heading4"/>
+      </w:pPr>
+      <w:bookmarkStart w:id="70" w:name="calibration-domain-sensitivity."/>
+      <w:r>
+        <w:t xml:space="preserve">Calibration domain sensitivity.</w:t>
+      </w:r>
+      <w:bookmarkEnd w:id="70"/>
+    </w:p>
+    <w:p>
+      <w:pPr>
+        <w:pStyle w:val="FirstParagraph"/>
+      </w:pPr>
+      <w:r>
+        <w:t xml:space="preserve">We use</w:t>
+      </w:r>
+      <w:r>
+        <w:t xml:space="preserve"> </w:t>
+      </w:r>
+      <m:oMath>
+        <m:r>
+          <m:t>16</m:t>
+        </m:r>
+      </m:oMath>
+      <w:r>
+        <w:t xml:space="preserve"> </w:t>
+      </w:r>
+      <w:r>
+        <w:t xml:space="preserve">samples from C4 or WikiText-2 for calibration. We have not studied how sensitive the resulting allocation is to calibration-domain mismatch; existing sensitivity-aware weight quantization work suggests it is fairly robust, but the question deserves direct study in the KV cache setting.</w:t>
+      </w:r>
+    </w:p>
+    <w:p>
+      <w:pPr>
         <w:pStyle w:val="Heading1"/>
       </w:pPr>
-      <w:bookmarkStart w:id="69" w:name="sec:conclusion"/>
+      <w:bookmarkStart w:id="71" w:name="sec:conclusion"/>
       <w:r>
         <w:t xml:space="preserve">Conclusion</w:t>
       </w:r>
-      <w:bookmarkEnd w:id="69"/>
+      <w:bookmarkEnd w:id="71"/>
     </w:p>
     <w:p>
       <w:pPr>
@@ -16727,7 +16905,7 @@
       <w:r>
         <w:t xml:space="preserve"> </w:t>
       </w:r>
-      <w:hyperlink r:id="rId70">
+      <w:hyperlink r:id="rId72">
         <w:r>
           <w:rPr>
             <w:rStyle w:val="Hyperlink"/>
@@ -16826,7 +17004,7 @@
       <w:r>
         <w:t xml:space="preserve"> </w:t>
       </w:r>
-      <w:hyperlink r:id="rId71">
+      <w:hyperlink r:id="rId73">
         <w:r>
           <w:rPr>
             <w:rStyle w:val="Hyperlink"/>

</xml_diff>

<commit_message>
Add Qwen32B downstream + hw benchmarks, downstream table in paper
Qwen2.5-32B downstream: FP16/TQ/KIVI identical (MMLU=0.822, ARC=0.650,
HellaSwag=0.550, WinoGrande=0.760). Same pattern as Mistral-7B.

Qwen2.5-32B hardware: FP16=8.2 tok/s, TQ K4V4=2.1 tok/s, KIVI-4=5.7 tok/s

Paper now includes:
- Table: downstream task accuracy (Section 6.4) for both models
- Updated hardware/roofline tables with Qwen32B row
- Rebuilt PDF (15 pages) and DOCX

Co-Authored-By: Claude Opus 4.6 (1M context) <noreply@anthropic.com>
</commit_message>
<xml_diff>
--- a/paper/main.docx
+++ b/paper/main.docx
@@ -14635,13 +14635,609 @@
       <w:pPr>
         <w:pStyle w:val="Heading2"/>
       </w:pPr>
-      <w:bookmarkStart w:id="57" w:name="sec:needle"/>
-      <w:r>
-        <w:t xml:space="preserve">Needle-in-a-Haystack</w:t>
+      <w:bookmarkStart w:id="57" w:name="sec:downstream"/>
+      <w:r>
+        <w:t xml:space="preserve">Downstream Task Accuracy</w:t>
       </w:r>
       <w:bookmarkEnd w:id="57"/>
     </w:p>
-    <w:bookmarkStart w:id="58" w:name="tab:needle"/>
+    <w:bookmarkStart w:id="58" w:name="tab:downstream"/>
+    <w:p>
+      <w:pPr>
+        <w:pStyle w:val="TableCaption"/>
+      </w:pPr>
+      <w:r>
+        <w:t xml:space="preserve">Downstream task accuracy under 4-bit KV cache compression on Qwen2.5-32B and Mistral-7B. All three methods (FP16, TurboQuant K4V4, KIVI-4) produce indistinguishable scores, confirming that compression preserves task quality on standard short-context benchmarks.</w:t>
+      </w:r>
+    </w:p>
+    <w:tbl>
+      <w:tblPr>
+        <w:tblStyle w:val="Table"/>
+        <w:tblW w:type="pct" w:w="0.0"/>
+        <w:tblLook w:firstRow="1"/>
+        <w:tblCaption w:val="Downstream task accuracy under 4-bit KV cache compression on Qwen2.5-32B and Mistral-7B. All three methods (FP16, TurboQuant K4V4, KIVI-4) produce indistinguishable scores, confirming that compression preserves task quality on standard short-context benchmarks."/>
+      </w:tblPr>
+      <w:tblGrid/>
+      <w:tr>
+        <w:trPr>
+          <w:cnfStyle w:firstRow="1"/>
+        </w:trPr>
+        <w:tc>
+          <w:tcPr>
+            <w:tcBorders>
+              <w:bottom w:val="single"/>
+            </w:tcBorders>
+            <w:vAlign w:val="bottom"/>
+          </w:tcPr>
+          <w:p>
+            <w:pPr>
+              <w:pStyle w:val="Compact"/>
+              <w:jc w:val="left"/>
+            </w:pPr>
+            <w:r>
+              <w:t xml:space="preserve">Model</w:t>
+            </w:r>
+          </w:p>
+        </w:tc>
+        <w:tc>
+          <w:tcPr>
+            <w:tcBorders>
+              <w:bottom w:val="single"/>
+            </w:tcBorders>
+            <w:vAlign w:val="bottom"/>
+          </w:tcPr>
+          <w:p>
+            <w:pPr>
+              <w:pStyle w:val="Compact"/>
+              <w:jc w:val="left"/>
+            </w:pPr>
+            <w:r>
+              <w:t xml:space="preserve">Method</w:t>
+            </w:r>
+          </w:p>
+        </w:tc>
+        <w:tc>
+          <w:tcPr>
+            <w:tcBorders>
+              <w:bottom w:val="single"/>
+            </w:tcBorders>
+            <w:vAlign w:val="bottom"/>
+          </w:tcPr>
+          <w:p>
+            <w:pPr>
+              <w:pStyle w:val="Compact"/>
+              <w:jc w:val="center"/>
+            </w:pPr>
+            <w:r>
+              <w:t xml:space="preserve">MMLU</w:t>
+            </w:r>
+          </w:p>
+        </w:tc>
+        <w:tc>
+          <w:tcPr>
+            <w:tcBorders>
+              <w:bottom w:val="single"/>
+            </w:tcBorders>
+            <w:vAlign w:val="bottom"/>
+          </w:tcPr>
+          <w:p>
+            <w:pPr>
+              <w:pStyle w:val="Compact"/>
+              <w:jc w:val="center"/>
+            </w:pPr>
+            <w:r>
+              <w:t xml:space="preserve">ARC-C</w:t>
+            </w:r>
+          </w:p>
+        </w:tc>
+        <w:tc>
+          <w:tcPr>
+            <w:tcBorders>
+              <w:bottom w:val="single"/>
+            </w:tcBorders>
+            <w:vAlign w:val="bottom"/>
+          </w:tcPr>
+          <w:p>
+            <w:pPr>
+              <w:pStyle w:val="Compact"/>
+              <w:jc w:val="center"/>
+            </w:pPr>
+            <w:r>
+              <w:t xml:space="preserve">HellaSwag</w:t>
+            </w:r>
+          </w:p>
+        </w:tc>
+        <w:tc>
+          <w:tcPr>
+            <w:tcBorders>
+              <w:bottom w:val="single"/>
+            </w:tcBorders>
+            <w:vAlign w:val="bottom"/>
+          </w:tcPr>
+          <w:p>
+            <w:pPr>
+              <w:pStyle w:val="Compact"/>
+              <w:jc w:val="center"/>
+            </w:pPr>
+            <w:r>
+              <w:t xml:space="preserve">WinoGrande</w:t>
+            </w:r>
+          </w:p>
+        </w:tc>
+      </w:tr>
+      <w:tr>
+        <w:tc>
+          <w:p>
+            <w:pPr>
+              <w:pStyle w:val="Compact"/>
+              <w:jc w:val="left"/>
+            </w:pPr>
+            <w:r>
+              <w:t xml:space="preserve">Qwen2.5-32B</w:t>
+            </w:r>
+          </w:p>
+        </w:tc>
+        <w:tc>
+          <w:p>
+            <w:pPr>
+              <w:pStyle w:val="Compact"/>
+              <w:jc w:val="left"/>
+            </w:pPr>
+            <w:r>
+              <w:t xml:space="preserve">FP16</w:t>
+            </w:r>
+          </w:p>
+        </w:tc>
+        <w:tc>
+          <w:p>
+            <w:pPr>
+              <w:pStyle w:val="Compact"/>
+              <w:jc w:val="center"/>
+            </w:pPr>
+            <w:r>
+              <w:t xml:space="preserve">0.822</w:t>
+            </w:r>
+          </w:p>
+        </w:tc>
+        <w:tc>
+          <w:p>
+            <w:pPr>
+              <w:pStyle w:val="Compact"/>
+              <w:jc w:val="center"/>
+            </w:pPr>
+            <w:r>
+              <w:t xml:space="preserve">0.650</w:t>
+            </w:r>
+          </w:p>
+        </w:tc>
+        <w:tc>
+          <w:p>
+            <w:pPr>
+              <w:pStyle w:val="Compact"/>
+              <w:jc w:val="center"/>
+            </w:pPr>
+            <w:r>
+              <w:t xml:space="preserve">0.550</w:t>
+            </w:r>
+          </w:p>
+        </w:tc>
+        <w:tc>
+          <w:p>
+            <w:pPr>
+              <w:pStyle w:val="Compact"/>
+              <w:jc w:val="center"/>
+            </w:pPr>
+            <w:r>
+              <w:t xml:space="preserve">0.760</w:t>
+            </w:r>
+          </w:p>
+        </w:tc>
+      </w:tr>
+      <w:tr>
+        <w:tc>
+          <w:p/>
+        </w:tc>
+        <w:tc>
+          <w:p>
+            <w:pPr>
+              <w:pStyle w:val="Compact"/>
+              <w:jc w:val="left"/>
+            </w:pPr>
+            <w:r>
+              <w:t xml:space="preserve">TQ K4V4</w:t>
+            </w:r>
+          </w:p>
+        </w:tc>
+        <w:tc>
+          <w:p>
+            <w:pPr>
+              <w:pStyle w:val="Compact"/>
+              <w:jc w:val="center"/>
+            </w:pPr>
+            <w:r>
+              <w:t xml:space="preserve">0.823</w:t>
+            </w:r>
+          </w:p>
+        </w:tc>
+        <w:tc>
+          <w:p>
+            <w:pPr>
+              <w:pStyle w:val="Compact"/>
+              <w:jc w:val="center"/>
+            </w:pPr>
+            <w:r>
+              <w:t xml:space="preserve">0.650</w:t>
+            </w:r>
+          </w:p>
+        </w:tc>
+        <w:tc>
+          <w:p>
+            <w:pPr>
+              <w:pStyle w:val="Compact"/>
+              <w:jc w:val="center"/>
+            </w:pPr>
+            <w:r>
+              <w:t xml:space="preserve">0.550</w:t>
+            </w:r>
+          </w:p>
+        </w:tc>
+        <w:tc>
+          <w:p>
+            <w:pPr>
+              <w:pStyle w:val="Compact"/>
+              <w:jc w:val="center"/>
+            </w:pPr>
+            <w:r>
+              <w:t xml:space="preserve">0.760</w:t>
+            </w:r>
+          </w:p>
+        </w:tc>
+      </w:tr>
+      <w:tr>
+        <w:tc>
+          <w:p/>
+        </w:tc>
+        <w:tc>
+          <w:p>
+            <w:pPr>
+              <w:pStyle w:val="Compact"/>
+              <w:jc w:val="left"/>
+            </w:pPr>
+            <w:r>
+              <w:t xml:space="preserve">KIVI-4</w:t>
+            </w:r>
+          </w:p>
+        </w:tc>
+        <w:tc>
+          <w:p>
+            <w:pPr>
+              <w:pStyle w:val="Compact"/>
+              <w:jc w:val="center"/>
+            </w:pPr>
+            <w:r>
+              <w:t xml:space="preserve">0.821</w:t>
+            </w:r>
+          </w:p>
+        </w:tc>
+        <w:tc>
+          <w:p>
+            <w:pPr>
+              <w:pStyle w:val="Compact"/>
+              <w:jc w:val="center"/>
+            </w:pPr>
+            <w:r>
+              <w:t xml:space="preserve">0.650</w:t>
+            </w:r>
+          </w:p>
+        </w:tc>
+        <w:tc>
+          <w:p>
+            <w:pPr>
+              <w:pStyle w:val="Compact"/>
+              <w:jc w:val="center"/>
+            </w:pPr>
+            <w:r>
+              <w:t xml:space="preserve">0.550</w:t>
+            </w:r>
+          </w:p>
+        </w:tc>
+        <w:tc>
+          <w:p>
+            <w:pPr>
+              <w:pStyle w:val="Compact"/>
+              <w:jc w:val="center"/>
+            </w:pPr>
+            <w:r>
+              <w:t xml:space="preserve">0.760</w:t>
+            </w:r>
+          </w:p>
+        </w:tc>
+      </w:tr>
+      <w:tr>
+        <w:tc>
+          <w:p>
+            <w:pPr>
+              <w:pStyle w:val="Compact"/>
+              <w:jc w:val="left"/>
+            </w:pPr>
+            <w:r>
+              <w:t xml:space="preserve">Mistral-7B</w:t>
+            </w:r>
+          </w:p>
+        </w:tc>
+        <w:tc>
+          <w:p>
+            <w:pPr>
+              <w:pStyle w:val="Compact"/>
+              <w:jc w:val="left"/>
+            </w:pPr>
+            <w:r>
+              <w:t xml:space="preserve">FP16</w:t>
+            </w:r>
+          </w:p>
+        </w:tc>
+        <w:tc>
+          <w:p>
+            <w:pPr>
+              <w:pStyle w:val="Compact"/>
+              <w:jc w:val="center"/>
+            </w:pPr>
+            <w:r>
+              <w:t xml:space="preserve">0.608</w:t>
+            </w:r>
+          </w:p>
+        </w:tc>
+        <w:tc>
+          <w:p>
+            <w:pPr>
+              <w:pStyle w:val="Compact"/>
+              <w:jc w:val="center"/>
+            </w:pPr>
+            <w:r>
+              <w:t xml:space="preserve">0.590</w:t>
+            </w:r>
+          </w:p>
+        </w:tc>
+        <w:tc>
+          <w:p>
+            <w:pPr>
+              <w:pStyle w:val="Compact"/>
+              <w:jc w:val="center"/>
+            </w:pPr>
+            <w:r>
+              <w:t xml:space="preserve">0.550</w:t>
+            </w:r>
+          </w:p>
+        </w:tc>
+        <w:tc>
+          <w:p>
+            <w:pPr>
+              <w:pStyle w:val="Compact"/>
+              <w:jc w:val="center"/>
+            </w:pPr>
+            <w:r>
+              <w:t xml:space="preserve">0.780</w:t>
+            </w:r>
+          </w:p>
+        </w:tc>
+      </w:tr>
+      <w:tr>
+        <w:tc>
+          <w:p/>
+        </w:tc>
+        <w:tc>
+          <w:p>
+            <w:pPr>
+              <w:pStyle w:val="Compact"/>
+              <w:jc w:val="left"/>
+            </w:pPr>
+            <w:r>
+              <w:t xml:space="preserve">TQ K4V4</w:t>
+            </w:r>
+          </w:p>
+        </w:tc>
+        <w:tc>
+          <w:p>
+            <w:pPr>
+              <w:pStyle w:val="Compact"/>
+              <w:jc w:val="center"/>
+            </w:pPr>
+            <w:r>
+              <w:t xml:space="preserve">0.608</w:t>
+            </w:r>
+          </w:p>
+        </w:tc>
+        <w:tc>
+          <w:p>
+            <w:pPr>
+              <w:pStyle w:val="Compact"/>
+              <w:jc w:val="center"/>
+            </w:pPr>
+            <w:r>
+              <w:t xml:space="preserve">0.590</w:t>
+            </w:r>
+          </w:p>
+        </w:tc>
+        <w:tc>
+          <w:p>
+            <w:pPr>
+              <w:pStyle w:val="Compact"/>
+              <w:jc w:val="center"/>
+            </w:pPr>
+            <w:r>
+              <w:t xml:space="preserve">0.550</w:t>
+            </w:r>
+          </w:p>
+        </w:tc>
+        <w:tc>
+          <w:p>
+            <w:pPr>
+              <w:pStyle w:val="Compact"/>
+              <w:jc w:val="center"/>
+            </w:pPr>
+            <w:r>
+              <w:t xml:space="preserve">0.780</w:t>
+            </w:r>
+          </w:p>
+        </w:tc>
+      </w:tr>
+      <w:tr>
+        <w:tc>
+          <w:p/>
+        </w:tc>
+        <w:tc>
+          <w:p>
+            <w:pPr>
+              <w:pStyle w:val="Compact"/>
+              <w:jc w:val="left"/>
+            </w:pPr>
+            <w:r>
+              <w:t xml:space="preserve">KIVI-4</w:t>
+            </w:r>
+          </w:p>
+        </w:tc>
+        <w:tc>
+          <w:p>
+            <w:pPr>
+              <w:pStyle w:val="Compact"/>
+              <w:jc w:val="center"/>
+            </w:pPr>
+            <w:r>
+              <w:t xml:space="preserve">0.606</w:t>
+            </w:r>
+          </w:p>
+        </w:tc>
+        <w:tc>
+          <w:p>
+            <w:pPr>
+              <w:pStyle w:val="Compact"/>
+              <w:jc w:val="center"/>
+            </w:pPr>
+            <w:r>
+              <w:t xml:space="preserve">0.590</w:t>
+            </w:r>
+          </w:p>
+        </w:tc>
+        <w:tc>
+          <w:p>
+            <w:pPr>
+              <w:pStyle w:val="Compact"/>
+              <w:jc w:val="center"/>
+            </w:pPr>
+            <w:r>
+              <w:t xml:space="preserve">0.550</w:t>
+            </w:r>
+          </w:p>
+        </w:tc>
+        <w:tc>
+          <w:p>
+            <w:pPr>
+              <w:pStyle w:val="Compact"/>
+              <w:jc w:val="center"/>
+            </w:pPr>
+            <w:r>
+              <w:t xml:space="preserve">0.780</w:t>
+            </w:r>
+          </w:p>
+        </w:tc>
+      </w:tr>
+    </w:tbl>
+    <w:bookmarkEnd w:id="58"/>
+    <w:p>
+      <w:pPr>
+        <w:pStyle w:val="BodyText"/>
+      </w:pPr>
+      <w:r>
+        <w:t xml:space="preserve">Table </w:t>
+      </w:r>
+      <w:hyperlink w:anchor="tab:downstream">
+        <w:r>
+          <w:rPr>
+            <w:rStyle w:val="Hyperlink"/>
+          </w:rPr>
+          <w:t xml:space="preserve">3</w:t>
+        </w:r>
+      </w:hyperlink>
+      <w:r>
+        <w:t xml:space="preserve"> </w:t>
+      </w:r>
+      <w:r>
+        <w:t xml:space="preserve">reports accuracy on four standard benchmarks under FP16, TurboQuant K4V4, and KIVI-4 at</w:t>
+      </w:r>
+      <w:r>
+        <w:t xml:space="preserve"> </w:t>
+      </w:r>
+      <m:oMath>
+        <m:r>
+          <m:t>4</m:t>
+        </m:r>
+      </m:oMath>
+      <w:r>
+        <w:t xml:space="preserve"> </w:t>
+      </w:r>
+      <w:r>
+        <w:t xml:space="preserve">bits. On both models, all three methods produce essentially identical scores (within</w:t>
+      </w:r>
+      <w:r>
+        <w:t xml:space="preserve"> </w:t>
+      </w:r>
+      <m:oMath>
+        <m:r>
+          <m:t>±</m:t>
+        </m:r>
+        <m:r>
+          <m:t>0.002</m:t>
+        </m:r>
+      </m:oMath>
+      <w:r>
+        <w:t xml:space="preserve">). This is expected: these benchmarks use short contexts (</w:t>
+      </w:r>
+      <m:oMath>
+        <m:r>
+          <m:t>≤</m:t>
+        </m:r>
+        <m:r>
+          <m:t>2</m:t>
+        </m:r>
+        <m:r>
+          <m:t>,</m:t>
+        </m:r>
+        <m:r>
+          <m:t>048</m:t>
+        </m:r>
+      </m:oMath>
+      <w:r>
+        <w:t xml:space="preserve"> </w:t>
+      </w:r>
+      <w:r>
+        <w:t xml:space="preserve">tokens per example), so the KV cache is small enough that the residual window in FP16 covers most of the sequence, and compression noise has negligible impact. The result confirms that KV cache compression at</w:t>
+      </w:r>
+      <w:r>
+        <w:t xml:space="preserve"> </w:t>
+      </w:r>
+      <m:oMath>
+        <m:r>
+          <m:t>4</m:t>
+        </m:r>
+      </m:oMath>
+      <w:r>
+        <w:t xml:space="preserve"> </w:t>
+      </w:r>
+      <w:r>
+        <w:t xml:space="preserve">bits does not degrade downstream task quality on standard benchmarks.</w:t>
+      </w:r>
+    </w:p>
+    <w:p>
+      <w:pPr>
+        <w:pStyle w:val="Heading2"/>
+      </w:pPr>
+      <w:bookmarkStart w:id="59" w:name="sec:needle"/>
+      <w:r>
+        <w:t xml:space="preserve">Needle-in-a-Haystack</w:t>
+      </w:r>
+      <w:bookmarkEnd w:id="59"/>
+    </w:p>
+    <w:bookmarkStart w:id="60" w:name="tab:needle"/>
     <w:p>
       <w:pPr>
         <w:pStyle w:val="TableCaption"/>
@@ -14959,7 +15555,7 @@
         </w:tc>
       </w:tr>
     </w:tbl>
-    <w:bookmarkEnd w:id="58"/>
+    <w:bookmarkEnd w:id="60"/>
     <w:p>
       <w:pPr>
         <w:pStyle w:val="BodyText"/>
@@ -14972,7 +15568,7 @@
           <w:rPr>
             <w:rStyle w:val="Hyperlink"/>
           </w:rPr>
-          <w:t xml:space="preserve">3</w:t>
+          <w:t xml:space="preserve">4</w:t>
         </w:r>
       </w:hyperlink>
       <w:r>
@@ -15033,13 +15629,13 @@
       <w:pPr>
         <w:pStyle w:val="Heading2"/>
       </w:pPr>
-      <w:bookmarkStart w:id="59" w:name="sec:hardware"/>
+      <w:bookmarkStart w:id="61" w:name="sec:hardware"/>
       <w:r>
         <w:t xml:space="preserve">Hardware Latency and Memory</w:t>
       </w:r>
-      <w:bookmarkEnd w:id="59"/>
+      <w:bookmarkEnd w:id="61"/>
     </w:p>
-    <w:bookmarkStart w:id="60" w:name="tab:hw"/>
+    <w:bookmarkStart w:id="62" w:name="tab:hw"/>
     <w:p>
       <w:pPr>
         <w:pStyle w:val="TableCaption"/>
@@ -15693,7 +16289,7 @@
               <w:jc w:val="left"/>
             </w:pPr>
             <w:r>
-              <w:t xml:space="preserve">Qwen2.5-3B</w:t>
+              <w:t xml:space="preserve">Qwen2.5-32B</w:t>
             </w:r>
           </w:p>
         </w:tc>
@@ -15715,7 +16311,7 @@
               <w:jc w:val="center"/>
             </w:pPr>
             <w:r>
-              <w:t xml:space="preserve">148</w:t>
+              <w:t xml:space="preserve">805</w:t>
             </w:r>
           </w:p>
         </w:tc>
@@ -15726,7 +16322,7 @@
               <w:jc w:val="center"/>
             </w:pPr>
             <w:r>
-              <w:t xml:space="preserve">24.4</w:t>
+              <w:t xml:space="preserve">8.2</w:t>
             </w:r>
           </w:p>
         </w:tc>
@@ -15737,7 +16333,7 @@
               <w:jc w:val="center"/>
             </w:pPr>
             <w:r>
-              <w:t xml:space="preserve">632</w:t>
+              <w:t xml:space="preserve">387</w:t>
             </w:r>
           </w:p>
         </w:tc>
@@ -15764,7 +16360,7 @@
               <w:jc w:val="center"/>
             </w:pPr>
             <w:r>
-              <w:t xml:space="preserve">290</w:t>
+              <w:t xml:space="preserve">1093</w:t>
             </w:r>
           </w:p>
         </w:tc>
@@ -15775,7 +16371,7 @@
               <w:jc w:val="center"/>
             </w:pPr>
             <w:r>
-              <w:t xml:space="preserve">2.4</w:t>
+              <w:t xml:space="preserve">2.1</w:t>
             </w:r>
           </w:p>
         </w:tc>
@@ -15786,7 +16382,7 @@
               <w:jc w:val="center"/>
             </w:pPr>
             <w:r>
-              <w:t xml:space="preserve">629</w:t>
+              <w:t xml:space="preserve">400</w:t>
             </w:r>
           </w:p>
         </w:tc>
@@ -15813,6 +16409,161 @@
               <w:jc w:val="center"/>
             </w:pPr>
             <w:r>
+              <w:t xml:space="preserve">850</w:t>
+            </w:r>
+          </w:p>
+        </w:tc>
+        <w:tc>
+          <w:p>
+            <w:pPr>
+              <w:pStyle w:val="Compact"/>
+              <w:jc w:val="center"/>
+            </w:pPr>
+            <w:r>
+              <w:t xml:space="preserve">5.7</w:t>
+            </w:r>
+          </w:p>
+        </w:tc>
+        <w:tc>
+          <w:p>
+            <w:pPr>
+              <w:pStyle w:val="Compact"/>
+              <w:jc w:val="center"/>
+            </w:pPr>
+            <w:r>
+              <w:t xml:space="preserve">413</w:t>
+            </w:r>
+          </w:p>
+        </w:tc>
+      </w:tr>
+      <w:tr>
+        <w:tc>
+          <w:p>
+            <w:pPr>
+              <w:pStyle w:val="Compact"/>
+              <w:jc w:val="left"/>
+            </w:pPr>
+            <w:r>
+              <w:t xml:space="preserve">Qwen2.5-3B</w:t>
+            </w:r>
+          </w:p>
+        </w:tc>
+        <w:tc>
+          <w:p>
+            <w:pPr>
+              <w:pStyle w:val="Compact"/>
+              <w:jc w:val="left"/>
+            </w:pPr>
+            <w:r>
+              <w:t xml:space="preserve">FP16</w:t>
+            </w:r>
+          </w:p>
+        </w:tc>
+        <w:tc>
+          <w:p>
+            <w:pPr>
+              <w:pStyle w:val="Compact"/>
+              <w:jc w:val="center"/>
+            </w:pPr>
+            <w:r>
+              <w:t xml:space="preserve">148</w:t>
+            </w:r>
+          </w:p>
+        </w:tc>
+        <w:tc>
+          <w:p>
+            <w:pPr>
+              <w:pStyle w:val="Compact"/>
+              <w:jc w:val="center"/>
+            </w:pPr>
+            <w:r>
+              <w:t xml:space="preserve">24.4</w:t>
+            </w:r>
+          </w:p>
+        </w:tc>
+        <w:tc>
+          <w:p>
+            <w:pPr>
+              <w:pStyle w:val="Compact"/>
+              <w:jc w:val="center"/>
+            </w:pPr>
+            <w:r>
+              <w:t xml:space="preserve">632</w:t>
+            </w:r>
+          </w:p>
+        </w:tc>
+      </w:tr>
+      <w:tr>
+        <w:tc>
+          <w:p/>
+        </w:tc>
+        <w:tc>
+          <w:p>
+            <w:pPr>
+              <w:pStyle w:val="Compact"/>
+              <w:jc w:val="left"/>
+            </w:pPr>
+            <w:r>
+              <w:t xml:space="preserve">TQ K4V4</w:t>
+            </w:r>
+          </w:p>
+        </w:tc>
+        <w:tc>
+          <w:p>
+            <w:pPr>
+              <w:pStyle w:val="Compact"/>
+              <w:jc w:val="center"/>
+            </w:pPr>
+            <w:r>
+              <w:t xml:space="preserve">290</w:t>
+            </w:r>
+          </w:p>
+        </w:tc>
+        <w:tc>
+          <w:p>
+            <w:pPr>
+              <w:pStyle w:val="Compact"/>
+              <w:jc w:val="center"/>
+            </w:pPr>
+            <w:r>
+              <w:t xml:space="preserve">2.4</w:t>
+            </w:r>
+          </w:p>
+        </w:tc>
+        <w:tc>
+          <w:p>
+            <w:pPr>
+              <w:pStyle w:val="Compact"/>
+              <w:jc w:val="center"/>
+            </w:pPr>
+            <w:r>
+              <w:t xml:space="preserve">629</w:t>
+            </w:r>
+          </w:p>
+        </w:tc>
+      </w:tr>
+      <w:tr>
+        <w:tc>
+          <w:p/>
+        </w:tc>
+        <w:tc>
+          <w:p>
+            <w:pPr>
+              <w:pStyle w:val="Compact"/>
+              <w:jc w:val="left"/>
+            </w:pPr>
+            <w:r>
+              <w:t xml:space="preserve">KIVI-4</w:t>
+            </w:r>
+          </w:p>
+        </w:tc>
+        <w:tc>
+          <w:p>
+            <w:pPr>
+              <w:pStyle w:val="Compact"/>
+              <w:jc w:val="center"/>
+            </w:pPr>
+            <w:r>
               <w:t xml:space="preserve">130</w:t>
             </w:r>
           </w:p>
@@ -15841,7 +16592,7 @@
         </w:tc>
       </w:tr>
     </w:tbl>
-    <w:bookmarkEnd w:id="60"/>
+    <w:bookmarkEnd w:id="62"/>
     <w:p>
       <w:pPr>
         <w:pStyle w:val="BodyText"/>
@@ -15854,7 +16605,7 @@
           <w:rPr>
             <w:rStyle w:val="Hyperlink"/>
           </w:rPr>
-          <w:t xml:space="preserve">4</w:t>
+          <w:t xml:space="preserve">5</w:t>
         </w:r>
       </w:hyperlink>
       <w:r>
@@ -15967,21 +16718,21 @@
       <w:pPr>
         <w:pStyle w:val="Heading1"/>
       </w:pPr>
-      <w:bookmarkStart w:id="61" w:name="sec:discussion"/>
+      <w:bookmarkStart w:id="63" w:name="sec:discussion"/>
       <w:r>
         <w:t xml:space="preserve">Discussion</w:t>
       </w:r>
-      <w:bookmarkEnd w:id="61"/>
+      <w:bookmarkEnd w:id="63"/>
     </w:p>
     <w:p>
       <w:pPr>
         <w:pStyle w:val="Heading4"/>
       </w:pPr>
-      <w:bookmarkStart w:id="62" w:name="X3efb250ab63edafddc268b83b287725c39dd13a"/>
+      <w:bookmarkStart w:id="64" w:name="X3efb250ab63edafddc268b83b287725c39dd13a"/>
       <w:r>
         <w:t xml:space="preserve">Why does GQA amplify VQ error specifically?</w:t>
       </w:r>
-      <w:bookmarkEnd w:id="62"/>
+      <w:bookmarkEnd w:id="64"/>
     </w:p>
     <w:p>
       <w:pPr>
@@ -16081,7 +16832,7 @@
       <w:pPr>
         <w:pStyle w:val="Heading4"/>
       </w:pPr>
-      <w:bookmarkStart w:id="63" w:name="why-is-layer-0-special"/>
+      <w:bookmarkStart w:id="65" w:name="why-is-layer-0-special"/>
       <w:r>
         <w:t xml:space="preserve">Why is layer</w:t>
       </w:r>
@@ -16098,170 +16849,6 @@
       </w:r>
       <w:r>
         <w:t xml:space="preserve">special?</w:t>
-      </w:r>
-      <w:bookmarkEnd w:id="63"/>
-    </w:p>
-    <w:p>
-      <w:pPr>
-        <w:pStyle w:val="FirstParagraph"/>
-      </w:pPr>
-      <w:r>
-        <w:t xml:space="preserve">Across all models we profiled, layer</w:t>
-      </w:r>
-      <w:r>
-        <w:t xml:space="preserve"> </w:t>
-      </w:r>
-      <m:oMath>
-        <m:r>
-          <m:t>0</m:t>
-        </m:r>
-      </m:oMath>
-      <w:r>
-        <w:t xml:space="preserve"> </w:t>
-      </w:r>
-      <w:r>
-        <w:t xml:space="preserve">keys are significantly more sensitive than keys in subsequent layers. This is consistent with the intuition that layer</w:t>
-      </w:r>
-      <w:r>
-        <w:t xml:space="preserve"> </w:t>
-      </w:r>
-      <m:oMath>
-        <m:r>
-          <m:t>0</m:t>
-        </m:r>
-      </m:oMath>
-      <w:r>
-        <w:t xml:space="preserve"> </w:t>
-      </w:r>
-      <w:r>
-        <w:t xml:space="preserve">performs the</w:t>
-      </w:r>
-      <w:r>
-        <w:t xml:space="preserve"> </w:t>
-      </w:r>
-      <w:r>
-        <w:t xml:space="preserve">“</w:t>
-      </w:r>
-      <w:r>
-        <w:t xml:space="preserve">token classification</w:t>
-      </w:r>
-      <w:r>
-        <w:t xml:space="preserve">”</w:t>
-      </w:r>
-      <w:r>
-        <w:t xml:space="preserve"> </w:t>
-      </w:r>
-      <w:r>
-        <w:t xml:space="preserve">part of the forward pass: its keys directly reflect token-identity information that has not yet been contextualized, and disrupting this information ripples through every subsequent layer. Layers near the output (layers</w:t>
-      </w:r>
-      <w:r>
-        <w:t xml:space="preserve"> </w:t>
-      </w:r>
-      <m:oMath>
-        <m:r>
-          <m:t>28</m:t>
-        </m:r>
-      </m:oMath>
-      <w:r>
-        <w:t xml:space="preserve">–</w:t>
-      </w:r>
-      <m:oMath>
-        <m:r>
-          <m:t>31</m:t>
-        </m:r>
-      </m:oMath>
-      <w:r>
-        <w:t xml:space="preserve"> </w:t>
-      </w:r>
-      <w:r>
-        <w:t xml:space="preserve">on a</w:t>
-      </w:r>
-      <w:r>
-        <w:t xml:space="preserve"> </w:t>
-      </w:r>
-      <m:oMath>
-        <m:r>
-          <m:t>32</m:t>
-        </m:r>
-      </m:oMath>
-      <w:r>
-        <w:t xml:space="preserve">-layer model) show a milder but still visible spike on the value side, which we tentatively attribute to their role in producing the final next-token distribution.</w:t>
-      </w:r>
-    </w:p>
-    <w:p>
-      <w:pPr>
-        <w:pStyle w:val="Heading4"/>
-      </w:pPr>
-      <w:bookmarkStart w:id="64" w:name="X2800a59bc8c97c8791e724484c2c5de6b341b38"/>
-      <w:r>
-        <w:t xml:space="preserve">Interaction of adaptive allocation and outlier grouping.</w:t>
-      </w:r>
-      <w:bookmarkEnd w:id="64"/>
-    </w:p>
-    <w:p>
-      <w:pPr>
-        <w:pStyle w:val="FirstParagraph"/>
-      </w:pPr>
-      <w:r>
-        <w:t xml:space="preserve">Our combined</w:t>
-      </w:r>
-      <w:r>
-        <w:t xml:space="preserve"> </w:t>
-      </w:r>
-      <w:r>
-        <w:t xml:space="preserve">“</w:t>
-      </w:r>
-      <w:r>
-        <w:t xml:space="preserve">adaptive + outlier</w:t>
-      </w:r>
-      <w:r>
-        <w:t xml:space="preserve">”</w:t>
-      </w:r>
-      <w:r>
-        <w:t xml:space="preserve"> </w:t>
-      </w:r>
-      <w:r>
-        <w:t xml:space="preserve">experiment on Qwen2.5-3B did not strictly dominate outlier-only, suggesting the two techniques are partly redundant in their effects: both devote additional precision to the most damaging channels, but through different mechanisms. A more integrated allocator that is aware of the outlier overhead budget may recover the small gap; we leave this to future work. In the meantime, we recommend outlier-aware grouping as the default on GQA-</w:t>
-      </w:r>
-      <m:oMath>
-        <m:r>
-          <m:t>8</m:t>
-        </m:r>
-        <m:r>
-          <m:t>:</m:t>
-        </m:r>
-        <m:r>
-          <m:t>1</m:t>
-        </m:r>
-      </m:oMath>
-      <w:r>
-        <w:t xml:space="preserve"> </w:t>
-      </w:r>
-      <w:r>
-        <w:t xml:space="preserve">models and adaptive allocation as the default for budgets below</w:t>
-      </w:r>
-      <w:r>
-        <w:t xml:space="preserve"> </w:t>
-      </w:r>
-      <m:oMath>
-        <m:r>
-          <m:t>4</m:t>
-        </m:r>
-      </m:oMath>
-      <w:r>
-        <w:t xml:space="preserve"> </w:t>
-      </w:r>
-      <w:r>
-        <w:t xml:space="preserve">bits.</w:t>
-      </w:r>
-    </w:p>
-    <w:p>
-      <w:pPr>
-        <w:pStyle w:val="Heading4"/>
-      </w:pPr>
-      <w:bookmarkStart w:id="65" w:name="calibration-cost."/>
-      <w:r>
-        <w:t xml:space="preserve">Calibration cost.</w:t>
       </w:r>
       <w:bookmarkEnd w:id="65"/>
     </w:p>
@@ -16270,28 +16857,192 @@
         <w:pStyle w:val="FirstParagraph"/>
       </w:pPr>
       <w:r>
-        <w:t xml:space="preserve">Both our methods require a one-time offline calibration of roughly a minute per model. This is negligible compared to training or even fine-tuning costs, and the resulting sensitivity profile and outlier channel list are small enough to ship with model checkpoints.</w:t>
+        <w:t xml:space="preserve">Across all models we profiled, layer</w:t>
+      </w:r>
+      <w:r>
+        <w:t xml:space="preserve"> </w:t>
+      </w:r>
+      <m:oMath>
+        <m:r>
+          <m:t>0</m:t>
+        </m:r>
+      </m:oMath>
+      <w:r>
+        <w:t xml:space="preserve"> </w:t>
+      </w:r>
+      <w:r>
+        <w:t xml:space="preserve">keys are significantly more sensitive than keys in subsequent layers. This is consistent with the intuition that layer</w:t>
+      </w:r>
+      <w:r>
+        <w:t xml:space="preserve"> </w:t>
+      </w:r>
+      <m:oMath>
+        <m:r>
+          <m:t>0</m:t>
+        </m:r>
+      </m:oMath>
+      <w:r>
+        <w:t xml:space="preserve"> </w:t>
+      </w:r>
+      <w:r>
+        <w:t xml:space="preserve">performs the</w:t>
+      </w:r>
+      <w:r>
+        <w:t xml:space="preserve"> </w:t>
+      </w:r>
+      <w:r>
+        <w:t xml:space="preserve">“</w:t>
+      </w:r>
+      <w:r>
+        <w:t xml:space="preserve">token classification</w:t>
+      </w:r>
+      <w:r>
+        <w:t xml:space="preserve">”</w:t>
+      </w:r>
+      <w:r>
+        <w:t xml:space="preserve"> </w:t>
+      </w:r>
+      <w:r>
+        <w:t xml:space="preserve">part of the forward pass: its keys directly reflect token-identity information that has not yet been contextualized, and disrupting this information ripples through every subsequent layer. Layers near the output (layers</w:t>
+      </w:r>
+      <w:r>
+        <w:t xml:space="preserve"> </w:t>
+      </w:r>
+      <m:oMath>
+        <m:r>
+          <m:t>28</m:t>
+        </m:r>
+      </m:oMath>
+      <w:r>
+        <w:t xml:space="preserve">–</w:t>
+      </w:r>
+      <m:oMath>
+        <m:r>
+          <m:t>31</m:t>
+        </m:r>
+      </m:oMath>
+      <w:r>
+        <w:t xml:space="preserve"> </w:t>
+      </w:r>
+      <w:r>
+        <w:t xml:space="preserve">on a</w:t>
+      </w:r>
+      <w:r>
+        <w:t xml:space="preserve"> </w:t>
+      </w:r>
+      <m:oMath>
+        <m:r>
+          <m:t>32</m:t>
+        </m:r>
+      </m:oMath>
+      <w:r>
+        <w:t xml:space="preserve">-layer model) show a milder but still visible spike on the value side, which we tentatively attribute to their role in producing the final next-token distribution.</w:t>
       </w:r>
     </w:p>
     <w:p>
       <w:pPr>
-        <w:pStyle w:val="Heading1"/>
-      </w:pPr>
-      <w:bookmarkStart w:id="66" w:name="sec:limitations"/>
-      <w:r>
-        <w:t xml:space="preserve">Limitations</w:t>
+        <w:pStyle w:val="Heading4"/>
+      </w:pPr>
+      <w:bookmarkStart w:id="66" w:name="X2800a59bc8c97c8791e724484c2c5de6b341b38"/>
+      <w:r>
+        <w:t xml:space="preserve">Interaction of adaptive allocation and outlier grouping.</w:t>
       </w:r>
       <w:bookmarkEnd w:id="66"/>
     </w:p>
     <w:p>
       <w:pPr>
+        <w:pStyle w:val="FirstParagraph"/>
+      </w:pPr>
+      <w:r>
+        <w:t xml:space="preserve">Our combined</w:t>
+      </w:r>
+      <w:r>
+        <w:t xml:space="preserve"> </w:t>
+      </w:r>
+      <w:r>
+        <w:t xml:space="preserve">“</w:t>
+      </w:r>
+      <w:r>
+        <w:t xml:space="preserve">adaptive + outlier</w:t>
+      </w:r>
+      <w:r>
+        <w:t xml:space="preserve">”</w:t>
+      </w:r>
+      <w:r>
+        <w:t xml:space="preserve"> </w:t>
+      </w:r>
+      <w:r>
+        <w:t xml:space="preserve">experiment on Qwen2.5-3B did not strictly dominate outlier-only, suggesting the two techniques are partly redundant in their effects: both devote additional precision to the most damaging channels, but through different mechanisms. A more integrated allocator that is aware of the outlier overhead budget may recover the small gap; we leave this to future work. In the meantime, we recommend outlier-aware grouping as the default on GQA-</w:t>
+      </w:r>
+      <m:oMath>
+        <m:r>
+          <m:t>8</m:t>
+        </m:r>
+        <m:r>
+          <m:t>:</m:t>
+        </m:r>
+        <m:r>
+          <m:t>1</m:t>
+        </m:r>
+      </m:oMath>
+      <w:r>
+        <w:t xml:space="preserve"> </w:t>
+      </w:r>
+      <w:r>
+        <w:t xml:space="preserve">models and adaptive allocation as the default for budgets below</w:t>
+      </w:r>
+      <w:r>
+        <w:t xml:space="preserve"> </w:t>
+      </w:r>
+      <m:oMath>
+        <m:r>
+          <m:t>4</m:t>
+        </m:r>
+      </m:oMath>
+      <w:r>
+        <w:t xml:space="preserve"> </w:t>
+      </w:r>
+      <w:r>
+        <w:t xml:space="preserve">bits.</w:t>
+      </w:r>
+    </w:p>
+    <w:p>
+      <w:pPr>
         <w:pStyle w:val="Heading4"/>
       </w:pPr>
-      <w:bookmarkStart w:id="67" w:name="implementation-speed."/>
+      <w:bookmarkStart w:id="67" w:name="calibration-cost."/>
+      <w:r>
+        <w:t xml:space="preserve">Calibration cost.</w:t>
+      </w:r>
+      <w:bookmarkEnd w:id="67"/>
+    </w:p>
+    <w:p>
+      <w:pPr>
+        <w:pStyle w:val="FirstParagraph"/>
+      </w:pPr>
+      <w:r>
+        <w:t xml:space="preserve">Both our methods require a one-time offline calibration of roughly a minute per model. This is negligible compared to training or even fine-tuning costs, and the resulting sensitivity profile and outlier channel list are small enough to ship with model checkpoints.</w:t>
+      </w:r>
+    </w:p>
+    <w:p>
+      <w:pPr>
+        <w:pStyle w:val="Heading1"/>
+      </w:pPr>
+      <w:bookmarkStart w:id="68" w:name="sec:limitations"/>
+      <w:r>
+        <w:t xml:space="preserve">Limitations</w:t>
+      </w:r>
+      <w:bookmarkEnd w:id="68"/>
+    </w:p>
+    <w:p>
+      <w:pPr>
+        <w:pStyle w:val="Heading4"/>
+      </w:pPr>
+      <w:bookmarkStart w:id="69" w:name="implementation-speed."/>
       <w:r>
         <w:t xml:space="preserve">Implementation speed.</w:t>
       </w:r>
-      <w:bookmarkEnd w:id="67"/>
+      <w:bookmarkEnd w:id="69"/>
     </w:p>
     <w:p>
       <w:pPr>
@@ -16305,7 +17056,7 @@
           <w:rPr>
             <w:rStyle w:val="Hyperlink"/>
           </w:rPr>
-          <w:t xml:space="preserve">6.6</w:t>
+          <w:t xml:space="preserve">6.7</w:t>
         </w:r>
       </w:hyperlink>
       <w:r>
@@ -16316,11 +17067,11 @@
       <w:pPr>
         <w:pStyle w:val="Heading4"/>
       </w:pPr>
-      <w:bookmarkStart w:id="68" w:name="llama-3.1-70b."/>
+      <w:bookmarkStart w:id="70" w:name="llama-3.1-70b."/>
       <w:r>
         <w:t xml:space="preserve">Llama-3.1-70B.</w:t>
       </w:r>
-      <w:bookmarkEnd w:id="68"/>
+      <w:bookmarkEnd w:id="70"/>
     </w:p>
     <w:p>
       <w:pPr>
@@ -16379,11 +17130,11 @@
       <w:pPr>
         <w:pStyle w:val="Heading4"/>
       </w:pPr>
-      <w:bookmarkStart w:id="69" w:name="gemma-3-calibration."/>
+      <w:bookmarkStart w:id="71" w:name="gemma-3-calibration."/>
       <w:r>
         <w:t xml:space="preserve">Gemma-3 calibration.</w:t>
       </w:r>
-      <w:bookmarkEnd w:id="69"/>
+      <w:bookmarkEnd w:id="71"/>
     </w:p>
     <w:p>
       <w:pPr>
@@ -16455,11 +17206,11 @@
       <w:pPr>
         <w:pStyle w:val="Heading4"/>
       </w:pPr>
-      <w:bookmarkStart w:id="70" w:name="calibration-domain-sensitivity."/>
+      <w:bookmarkStart w:id="72" w:name="calibration-domain-sensitivity."/>
       <w:r>
         <w:t xml:space="preserve">Calibration domain sensitivity.</w:t>
       </w:r>
-      <w:bookmarkEnd w:id="70"/>
+      <w:bookmarkEnd w:id="72"/>
     </w:p>
     <w:p>
       <w:pPr>
@@ -16487,11 +17238,11 @@
       <w:pPr>
         <w:pStyle w:val="Heading1"/>
       </w:pPr>
-      <w:bookmarkStart w:id="71" w:name="sec:conclusion"/>
+      <w:bookmarkStart w:id="73" w:name="sec:conclusion"/>
       <w:r>
         <w:t xml:space="preserve">Conclusion</w:t>
       </w:r>
-      <w:bookmarkEnd w:id="71"/>
+      <w:bookmarkEnd w:id="73"/>
     </w:p>
     <w:p>
       <w:pPr>
@@ -16905,7 +17656,7 @@
       <w:r>
         <w:t xml:space="preserve"> </w:t>
       </w:r>
-      <w:hyperlink r:id="rId72">
+      <w:hyperlink r:id="rId74">
         <w:r>
           <w:rPr>
             <w:rStyle w:val="Hyperlink"/>
@@ -17004,7 +17755,7 @@
       <w:r>
         <w:t xml:space="preserve"> </w:t>
       </w:r>
-      <w:hyperlink r:id="rId73">
+      <w:hyperlink r:id="rId75">
         <w:r>
           <w:rPr>
             <w:rStyle w:val="Hyperlink"/>

</xml_diff>